<commit_message>
Update CV Word document and public download file with latest full-stack engineer details, projects, MSc Financial Engineering, and references
</commit_message>
<xml_diff>
--- a/Alex_Teye_Ametepey_CV.docx
+++ b/Alex_Teye_Ametepey_CV.docx
@@ -11,28 +11,28 @@
           <w:rFonts w:ascii="Calibri" w:hAnsi="Calibri"/>
           <w:b/>
           <w:color w:val="0F172A"/>
-          <w:sz w:val="48"/>
+          <w:sz w:val="44"/>
         </w:rPr>
-        <w:t>Alex Teye Ametepey</w:t>
+        <w:t>ALEX TEYE AMETEPEY</w:t>
       </w:r>
     </w:p>
     <w:p>
       <w:pPr>
-        <w:spacing w:after="160"/>
+        <w:spacing w:after="120"/>
       </w:pPr>
       <w:r>
         <w:rPr>
           <w:rFonts w:ascii="Calibri" w:hAnsi="Calibri"/>
           <w:b/>
           <w:color w:val="D97706"/>
-          <w:sz w:val="26"/>
+          <w:sz w:val="24"/>
         </w:rPr>
-        <w:t>Backend Architect &amp; Systems Engineer</w:t>
+        <w:t>Full-Stack Software Engineer &amp; Systems Architect</w:t>
       </w:r>
     </w:p>
     <w:p>
       <w:pPr>
-        <w:spacing w:after="280"/>
+        <w:spacing w:after="240"/>
       </w:pPr>
       <w:r>
         <w:rPr>
@@ -40,15 +40,15 @@
           <w:color w:val="64748B"/>
           <w:sz w:val="19"/>
         </w:rPr>
-        <w:t>Accra, Ghana  |  alexteyeametepey@gmail.com  |  +233 54 904 4977</w:t>
+        <w:t>Accra, Ghana  |  0549044977  |  alexteyeametepey@gmail.com</w:t>
         <w:br/>
-        <w:t>GitHub: github.com/aa-Teye  |  LinkedIn: linkedin.com/in/alex-ametepey-1123a3205</w:t>
+        <w:t>GitHub: github.com/aa-Teye  |  LinkedIn: linkedin.com/in/alex-ametepey-1123a3205  |  Portfolio: alex-portfolio-sooty.vercel.app</w:t>
       </w:r>
     </w:p>
     <w:p>
       <w:pPr>
         <w:keepNext/>
-        <w:spacing w:before="280" w:after="80"/>
+        <w:spacing w:before="240" w:after="80"/>
       </w:pPr>
       <w:r>
         <w:rPr>
@@ -57,26 +57,26 @@
           <w:color w:val="0F172A"/>
           <w:sz w:val="22"/>
         </w:rPr>
-        <w:t>EXECUTIVE SUMMARY</w:t>
+        <w:t>PROFESSIONAL SUMMARY</w:t>
       </w:r>
     </w:p>
     <w:p>
       <w:pPr>
-        <w:spacing w:after="200"/>
+        <w:spacing w:after="160" w:line="276" w:lineRule="auto"/>
       </w:pPr>
       <w:r>
         <w:rPr>
           <w:rFonts w:ascii="Calibri" w:hAnsi="Calibri"/>
           <w:color w:val="334155"/>
-          <w:sz w:val="20"/>
+          <w:sz w:val="19"/>
         </w:rPr>
-        <w:t>Full-Stack &amp; Backend Architect with a BSc in Information Technology from the University of Ghana and a specialized focus on AI, Machine Learning, and Computer Vision. Currently a Research Assistant developing spatio-temporal Graph Neural Networks, I engineer complete, end-to-end production systems — bridging deep learning models with high-concurrency backends, real-time WebRTC/WebSocket streaming, and responsive web/mobile interfaces.</w:t>
+        <w:t>Results-driven Full-Stack Software Engineer and Systems Architect with a strong track record of leading technical teams to deliver end-to-end enterprise platforms, mobile applications, and automated growth systems. Transitioning a background in machine learning and backend architecture into comprehensive full-stack development to solve complex operational challenges. Currently pursuing an MSc in Financial Engineering to integrate quantitative data modeling into production-grade software architectures.</w:t>
       </w:r>
     </w:p>
     <w:p>
       <w:pPr>
         <w:keepNext/>
-        <w:spacing w:before="280" w:after="80"/>
+        <w:spacing w:before="240" w:after="80"/>
       </w:pPr>
       <w:r>
         <w:rPr>
@@ -85,128 +85,281 @@
           <w:color w:val="0F172A"/>
           <w:sz w:val="22"/>
         </w:rPr>
-        <w:t>CORE COMPETENCIES &amp; TECHNICAL SKILLS</w:t>
+        <w:t>TECHNICAL SKILLS</w:t>
       </w:r>
     </w:p>
     <w:p>
       <w:pPr>
         <w:pStyle w:val="ListBullet"/>
-        <w:spacing w:before="0" w:after="40" w:line="276" w:lineRule="auto"/>
+        <w:spacing w:before="0" w:after="50" w:line="276" w:lineRule="auto"/>
       </w:pPr>
       <w:r>
         <w:rPr>
           <w:rFonts w:ascii="Calibri" w:hAnsi="Calibri"/>
           <w:b/>
           <w:color w:val="334155"/>
-          <w:sz w:val="20"/>
+          <w:sz w:val="19"/>
         </w:rPr>
-        <w:t xml:space="preserve">Backend Engineering: </w:t>
+        <w:t xml:space="preserve">Languages: </w:t>
       </w:r>
       <w:r>
         <w:rPr>
           <w:rFonts w:ascii="Calibri" w:hAnsi="Calibri"/>
           <w:color w:val="334155"/>
-          <w:sz w:val="20"/>
+          <w:sz w:val="19"/>
         </w:rPr>
-        <w:t>Python, FastAPI, PostgreSQL, Redis (Distributed Locks/Caching), Celery, RabbitMQ, Kafka, TimescaleDB, Pydantic v2, REST APIs, WebSockets, WebRTC</w:t>
+        <w:t>Python, JavaScript (ES6+), Java, SQL, HTML5, CSS3</w:t>
       </w:r>
     </w:p>
     <w:p>
       <w:pPr>
         <w:pStyle w:val="ListBullet"/>
-        <w:spacing w:before="0" w:after="40" w:line="276" w:lineRule="auto"/>
+        <w:spacing w:before="0" w:after="50" w:line="276" w:lineRule="auto"/>
       </w:pPr>
       <w:r>
         <w:rPr>
           <w:rFonts w:ascii="Calibri" w:hAnsi="Calibri"/>
           <w:b/>
           <w:color w:val="334155"/>
-          <w:sz w:val="20"/>
+          <w:sz w:val="19"/>
         </w:rPr>
-        <w:t xml:space="preserve">AI &amp; Machine Learning: </w:t>
+        <w:t xml:space="preserve">Frontend &amp; Mobile: </w:t>
       </w:r>
       <w:r>
         <w:rPr>
           <w:rFonts w:ascii="Calibri" w:hAnsi="Calibri"/>
           <w:color w:val="334155"/>
-          <w:sz w:val="20"/>
+          <w:sz w:val="19"/>
         </w:rPr>
-        <w:t>PyTorch, PyTorch Geometric, Graph Neural Networks (GNNs), Computer Vision, Spatio-Temporal Graph Transformers, Prompt Engineering, AI Microservices</w:t>
+        <w:t>React, Next.js, Astro, Vite, Tailwind CSS, Cross-Platform Mobile Development (React Native), Electron</w:t>
       </w:r>
     </w:p>
     <w:p>
       <w:pPr>
         <w:pStyle w:val="ListBullet"/>
-        <w:spacing w:before="0" w:after="40" w:line="276" w:lineRule="auto"/>
+        <w:spacing w:before="0" w:after="50" w:line="276" w:lineRule="auto"/>
       </w:pPr>
       <w:r>
         <w:rPr>
           <w:rFonts w:ascii="Calibri" w:hAnsi="Calibri"/>
           <w:b/>
           <w:color w:val="334155"/>
-          <w:sz w:val="20"/>
+          <w:sz w:val="19"/>
         </w:rPr>
-        <w:t xml:space="preserve">DevOps &amp; Cloud: </w:t>
+        <w:t xml:space="preserve">Backend &amp; Architecture: </w:t>
       </w:r>
       <w:r>
         <w:rPr>
           <w:rFonts w:ascii="Calibri" w:hAnsi="Calibri"/>
           <w:color w:val="334155"/>
-          <w:sz w:val="20"/>
+          <w:sz w:val="19"/>
         </w:rPr>
-        <w:t>Docker, Docker Compose, Multi-stage Builds, AWS S3, AWS CloudFront, Git, GitHub Actions (CI/CD), Linux Administration</w:t>
+        <w:t>FastAPI, RESTful API Design, System Design, JWT Authentication, Redis (Caching &amp; Queues)</w:t>
       </w:r>
     </w:p>
     <w:p>
       <w:pPr>
         <w:pStyle w:val="ListBullet"/>
-        <w:spacing w:before="0" w:after="40" w:line="276" w:lineRule="auto"/>
+        <w:spacing w:before="0" w:after="50" w:line="276" w:lineRule="auto"/>
       </w:pPr>
       <w:r>
         <w:rPr>
           <w:rFonts w:ascii="Calibri" w:hAnsi="Calibri"/>
           <w:b/>
           <w:color w:val="334155"/>
-          <w:sz w:val="20"/>
+          <w:sz w:val="19"/>
         </w:rPr>
-        <w:t xml:space="preserve">Frontend &amp; Media: </w:t>
+        <w:t xml:space="preserve">Databases &amp; Storage: </w:t>
       </w:r>
       <w:r>
         <w:rPr>
           <w:rFonts w:ascii="Calibri" w:hAnsi="Calibri"/>
           <w:color w:val="334155"/>
-          <w:sz w:val="20"/>
+          <w:sz w:val="19"/>
         </w:rPr>
-        <w:t>React, React Native, TypeScript, Tailwind CSS, vMix API, OBS, WebRTC Live Streaming, Media Automation</w:t>
+        <w:t>Neon (Serverless PostgreSQL), PostgreSQL, SQLite, Relational Schema Design</w:t>
       </w:r>
     </w:p>
     <w:p>
       <w:pPr>
         <w:pStyle w:val="ListBullet"/>
-        <w:spacing w:before="0" w:after="40" w:line="276" w:lineRule="auto"/>
+        <w:spacing w:before="0" w:after="50" w:line="276" w:lineRule="auto"/>
       </w:pPr>
       <w:r>
         <w:rPr>
           <w:rFonts w:ascii="Calibri" w:hAnsi="Calibri"/>
           <w:b/>
           <w:color w:val="334155"/>
-          <w:sz w:val="20"/>
+          <w:sz w:val="19"/>
         </w:rPr>
-        <w:t xml:space="preserve">Engineering Leadership: </w:t>
+        <w:t xml:space="preserve">DevOps &amp; Workflows: </w:t>
       </w:r>
       <w:r>
         <w:rPr>
           <w:rFonts w:ascii="Calibri" w:hAnsi="Calibri"/>
           <w:color w:val="334155"/>
-          <w:sz w:val="20"/>
+          <w:sz w:val="19"/>
         </w:rPr>
-        <w:t>Agile/Scrum, Git Workflow, Technical Mentorship, Code Reviews, Jira, Technical Communication</w:t>
+        <w:t>Vercel, Render, Git, GitHub, Jira, Agile Sprint Planning</w:t>
+      </w:r>
+    </w:p>
+    <w:p>
+      <w:pPr>
+        <w:pStyle w:val="ListBullet"/>
+        <w:spacing w:before="0" w:after="50" w:line="276" w:lineRule="auto"/>
+      </w:pPr>
+      <w:r>
+        <w:rPr>
+          <w:rFonts w:ascii="Calibri" w:hAnsi="Calibri"/>
+          <w:b/>
+          <w:color w:val="334155"/>
+          <w:sz w:val="19"/>
+        </w:rPr>
+        <w:t xml:space="preserve">Media Systems: </w:t>
+      </w:r>
+      <w:r>
+        <w:rPr>
+          <w:rFonts w:ascii="Calibri" w:hAnsi="Calibri"/>
+          <w:color w:val="334155"/>
+          <w:sz w:val="19"/>
+        </w:rPr>
+        <w:t>Live Broadcast Routing (vMix)</w:t>
       </w:r>
     </w:p>
     <w:p>
       <w:pPr>
         <w:keepNext/>
-        <w:spacing w:before="280" w:after="80"/>
+        <w:spacing w:before="240" w:after="80"/>
+      </w:pPr>
+      <w:r>
+        <w:rPr>
+          <w:rFonts w:ascii="Calibri" w:hAnsi="Calibri"/>
+          <w:b/>
+          <w:color w:val="0F172A"/>
+          <w:sz w:val="22"/>
+        </w:rPr>
+        <w:t>KEY FULL-STACK &amp; SYSTEM ARCHITECTURE PROJECTS</w:t>
+      </w:r>
+    </w:p>
+    <w:p>
+      <w:pPr>
+        <w:pStyle w:val="ListBullet"/>
+        <w:spacing w:before="0" w:after="50" w:line="276" w:lineRule="auto"/>
+      </w:pPr>
+      <w:r>
+        <w:rPr>
+          <w:rFonts w:ascii="Calibri" w:hAnsi="Calibri"/>
+          <w:b/>
+          <w:color w:val="334155"/>
+          <w:sz w:val="19"/>
+        </w:rPr>
+        <w:t xml:space="preserve">Ghana HIVdr Platform (Ongoing): </w:t>
+      </w:r>
+      <w:r>
+        <w:rPr>
+          <w:rFonts w:ascii="Calibri" w:hAnsi="Calibri"/>
+          <w:color w:val="334155"/>
+          <w:sz w:val="19"/>
+        </w:rPr>
+        <w:t>Lead the full-stack architecture and data synchronization pipelines for secure, real-time health-tech reporting and record tracking.</w:t>
+      </w:r>
+    </w:p>
+    <w:p>
+      <w:pPr>
+        <w:pStyle w:val="ListBullet"/>
+        <w:spacing w:before="0" w:after="50" w:line="276" w:lineRule="auto"/>
+      </w:pPr>
+      <w:r>
+        <w:rPr>
+          <w:rFonts w:ascii="Calibri" w:hAnsi="Calibri"/>
+          <w:b/>
+          <w:color w:val="334155"/>
+          <w:sz w:val="19"/>
+        </w:rPr>
+        <w:t xml:space="preserve">Enterprise ERP &amp; Custom CMS Solutions: </w:t>
+      </w:r>
+      <w:r>
+        <w:rPr>
+          <w:rFonts w:ascii="Calibri" w:hAnsi="Calibri"/>
+          <w:color w:val="334155"/>
+          <w:sz w:val="19"/>
+        </w:rPr>
+        <w:t>Architected multi-tenant database schemas, automated operational workflows, and role-based access control (RBAC) systems across diverse client requirements.</w:t>
+      </w:r>
+    </w:p>
+    <w:p>
+      <w:pPr>
+        <w:pStyle w:val="ListBullet"/>
+        <w:spacing w:before="0" w:after="50" w:line="276" w:lineRule="auto"/>
+      </w:pPr>
+      <w:r>
+        <w:rPr>
+          <w:rFonts w:ascii="Calibri" w:hAnsi="Calibri"/>
+          <w:b/>
+          <w:color w:val="334155"/>
+          <w:sz w:val="19"/>
+        </w:rPr>
+        <w:t xml:space="preserve">Automated Examination Management System: </w:t>
+      </w:r>
+      <w:r>
+        <w:rPr>
+          <w:rFonts w:ascii="Calibri" w:hAnsi="Calibri"/>
+          <w:color w:val="334155"/>
+          <w:sz w:val="19"/>
+        </w:rPr>
+        <w:t>Built a secure assessment engine supporting automated grading logic, audit logging, and encrypted academic record handling.</w:t>
+      </w:r>
+    </w:p>
+    <w:p>
+      <w:pPr>
+        <w:pStyle w:val="ListBullet"/>
+        <w:spacing w:before="0" w:after="50" w:line="276" w:lineRule="auto"/>
+      </w:pPr>
+      <w:r>
+        <w:rPr>
+          <w:rFonts w:ascii="Calibri" w:hAnsi="Calibri"/>
+          <w:b/>
+          <w:color w:val="334155"/>
+          <w:sz w:val="19"/>
+        </w:rPr>
+        <w:t xml:space="preserve">Church Management &amp; Operations System (SPS): </w:t>
+      </w:r>
+      <w:r>
+        <w:rPr>
+          <w:rFonts w:ascii="Calibri" w:hAnsi="Calibri"/>
+          <w:color w:val="334155"/>
+          <w:sz w:val="19"/>
+        </w:rPr>
+        <w:t>Engineered an integrated platform for database administration, member tracking, and automated service coordination.</w:t>
+      </w:r>
+    </w:p>
+    <w:p>
+      <w:pPr>
+        <w:pStyle w:val="ListBullet"/>
+        <w:spacing w:before="0" w:after="50" w:line="276" w:lineRule="auto"/>
+      </w:pPr>
+      <w:r>
+        <w:rPr>
+          <w:rFonts w:ascii="Calibri" w:hAnsi="Calibri"/>
+          <w:b/>
+          <w:color w:val="334155"/>
+          <w:sz w:val="19"/>
+        </w:rPr>
+        <w:t xml:space="preserve">UGDS System: </w:t>
+      </w:r>
+      <w:r>
+        <w:rPr>
+          <w:rFonts w:ascii="Calibri" w:hAnsi="Calibri"/>
+          <w:color w:val="334155"/>
+          <w:sz w:val="19"/>
+        </w:rPr>
+        <w:t>Led the complete full-stack architecture, API endpoint specifications, and database performance optimization as Lead Engineer and Full-Stack Developer.</w:t>
+      </w:r>
+    </w:p>
+    <w:p>
+      <w:pPr>
+        <w:keepNext/>
+        <w:spacing w:before="240" w:after="80"/>
       </w:pPr>
       <w:r>
         <w:rPr>
@@ -226,59 +379,45 @@
         <w:rPr>
           <w:b/>
           <w:color w:val="0F172A"/>
-          <w:sz w:val="21"/>
+          <w:sz w:val="20"/>
         </w:rPr>
-        <w:t>Research Assistant  |  University of Ghana (Prof. Kofi Sarpong Adu-Manu)</w:t>
+        <w:t>Software Developer (Contract)  |  Aréte Forge</w:t>
       </w:r>
       <w:r>
         <w:rPr>
           <w:color w:val="64748B"/>
-          <w:sz w:val="19"/>
+          <w:sz w:val="18"/>
         </w:rPr>
         <w:tab/>
-        <w:t>2023 — Present</w:t>
+        <w:t>Ongoing</w:t>
       </w:r>
     </w:p>
     <w:p>
       <w:pPr>
         <w:pStyle w:val="ListBullet"/>
-        <w:spacing w:before="0" w:after="40" w:line="276" w:lineRule="auto"/>
+        <w:spacing w:before="0" w:after="50" w:line="276" w:lineRule="auto"/>
       </w:pPr>
       <w:r>
         <w:rPr>
           <w:rFonts w:ascii="Calibri" w:hAnsi="Calibri"/>
           <w:color w:val="334155"/>
-          <w:sz w:val="20"/>
+          <w:sz w:val="19"/>
         </w:rPr>
-        <w:t>Conduct deep learning research on Spatio-Temporal Graph Transformer architectures for water distribution infrastructure monitoring and leakage detection.</w:t>
+        <w:t>Architect and deploy comprehensive full-stack solutions, engineering seamless experiences from responsive web platforms to mobile applications.</w:t>
       </w:r>
     </w:p>
     <w:p>
       <w:pPr>
         <w:pStyle w:val="ListBullet"/>
-        <w:spacing w:before="0" w:after="40" w:line="276" w:lineRule="auto"/>
+        <w:spacing w:before="0" w:after="50" w:line="276" w:lineRule="auto"/>
       </w:pPr>
       <w:r>
         <w:rPr>
           <w:rFonts w:ascii="Calibri" w:hAnsi="Calibri"/>
           <w:color w:val="334155"/>
-          <w:sz w:val="20"/>
+          <w:sz w:val="19"/>
         </w:rPr>
-        <w:t>Engineered the DiTEC preprocessing pipeline with two-pass normalization producing exact-dimension feature tensors.</w:t>
-      </w:r>
-    </w:p>
-    <w:p>
-      <w:pPr>
-        <w:pStyle w:val="ListBullet"/>
-        <w:spacing w:before="0" w:after="40" w:line="276" w:lineRule="auto"/>
-      </w:pPr>
-      <w:r>
-        <w:rPr>
-          <w:rFonts w:ascii="Calibri" w:hAnsi="Calibri"/>
-          <w:color w:val="334155"/>
-          <w:sz w:val="20"/>
-        </w:rPr>
-        <w:t>Developed Transferable Foundation GNNs using PyTorch Geometric, reducing model convergence time by 40%.</w:t>
+        <w:t>Maintain modular backend microservices using Python and FastAPI, bridging APIs with modern frontend interfaces.</w:t>
       </w:r>
     </w:p>
     <w:p>
@@ -289,14 +428,14 @@
         <w:rPr>
           <w:b/>
           <w:color w:val="0F172A"/>
-          <w:sz w:val="21"/>
+          <w:sz w:val="20"/>
         </w:rPr>
-        <w:t>Lead Backend Developer (Contract)  |  Meditel Inc.</w:t>
+        <w:t>Backend Developer (Contract)  |  Meditel</w:t>
       </w:r>
       <w:r>
         <w:rPr>
           <w:color w:val="64748B"/>
-          <w:sz w:val="19"/>
+          <w:sz w:val="18"/>
         </w:rPr>
         <w:tab/>
         <w:t>Ongoing</w:t>
@@ -305,43 +444,29 @@
     <w:p>
       <w:pPr>
         <w:pStyle w:val="ListBullet"/>
-        <w:spacing w:before="0" w:after="40" w:line="276" w:lineRule="auto"/>
+        <w:spacing w:before="0" w:after="50" w:line="276" w:lineRule="auto"/>
       </w:pPr>
       <w:r>
         <w:rPr>
           <w:rFonts w:ascii="Calibri" w:hAnsi="Calibri"/>
           <w:color w:val="334155"/>
-          <w:sz w:val="20"/>
+          <w:sz w:val="19"/>
         </w:rPr>
-        <w:t>Lead backend developer for StrokeNet, a real-time stroke emergency response platform spanning Web, Mobile, Desktop, and Smartwatches.</w:t>
+        <w:t>Design and deploy secure RESTful endpoints and high-performance backend services using Python and FastAPI.</w:t>
       </w:r>
     </w:p>
     <w:p>
       <w:pPr>
         <w:pStyle w:val="ListBullet"/>
-        <w:spacing w:before="0" w:after="40" w:line="276" w:lineRule="auto"/>
+        <w:spacing w:before="0" w:after="50" w:line="276" w:lineRule="auto"/>
       </w:pPr>
       <w:r>
         <w:rPr>
           <w:rFonts w:ascii="Calibri" w:hAnsi="Calibri"/>
           <w:color w:val="334155"/>
-          <w:sz w:val="20"/>
+          <w:sz w:val="19"/>
         </w:rPr>
-        <w:t>Architected real-time alert routing infrastructure using WebRTC and Socket.IO for low-latency emergency notifications.</w:t>
-      </w:r>
-    </w:p>
-    <w:p>
-      <w:pPr>
-        <w:pStyle w:val="ListBullet"/>
-        <w:spacing w:before="0" w:after="40" w:line="276" w:lineRule="auto"/>
-      </w:pPr>
-      <w:r>
-        <w:rPr>
-          <w:rFonts w:ascii="Calibri" w:hAnsi="Calibri"/>
-          <w:color w:val="334155"/>
-          <w:sz w:val="20"/>
-        </w:rPr>
-        <w:t>Built automated AI assessment pipeline using FastAPI, Celery queues, and AWS S3 to process medical imaging.</w:t>
+        <w:t>Collaborate closely with frontend engineers to integrate backend services seamlessly into React-based applications.</w:t>
       </w:r>
     </w:p>
     <w:p>
@@ -352,14 +477,14 @@
         <w:rPr>
           <w:b/>
           <w:color w:val="0F172A"/>
-          <w:sz w:val="21"/>
+          <w:sz w:val="20"/>
         </w:rPr>
-        <w:t>Software Developer  |  AreteForge</w:t>
+        <w:t>Growth Engineer (Contract)  |  WAICA</w:t>
       </w:r>
       <w:r>
         <w:rPr>
           <w:color w:val="64748B"/>
-          <w:sz w:val="19"/>
+          <w:sz w:val="18"/>
         </w:rPr>
         <w:tab/>
         <w:t>Ongoing</w:t>
@@ -368,15 +493,29 @@
     <w:p>
       <w:pPr>
         <w:pStyle w:val="ListBullet"/>
-        <w:spacing w:before="0" w:after="40" w:line="276" w:lineRule="auto"/>
+        <w:spacing w:before="0" w:after="50" w:line="276" w:lineRule="auto"/>
       </w:pPr>
       <w:r>
         <w:rPr>
           <w:rFonts w:ascii="Calibri" w:hAnsi="Calibri"/>
           <w:color w:val="334155"/>
-          <w:sz w:val="20"/>
+          <w:sz w:val="19"/>
         </w:rPr>
-        <w:t>Developed production-grade backend microservices in Python following Agile/Scrum sprint workflows with Git and Jira.</w:t>
+        <w:t>Design and implement automated customer acquisition funnels, technical marketing systems, and digital growth campaigns.</w:t>
+      </w:r>
+    </w:p>
+    <w:p>
+      <w:pPr>
+        <w:pStyle w:val="ListBullet"/>
+        <w:spacing w:before="0" w:after="50" w:line="276" w:lineRule="auto"/>
+      </w:pPr>
+      <w:r>
+        <w:rPr>
+          <w:rFonts w:ascii="Calibri" w:hAnsi="Calibri"/>
+          <w:color w:val="334155"/>
+          <w:sz w:val="19"/>
+        </w:rPr>
+        <w:t>Leverage data analytics and automation tools to optimize conversion rates and expand digital brand presence.</w:t>
       </w:r>
     </w:p>
     <w:p>
@@ -387,31 +526,45 @@
         <w:rPr>
           <w:b/>
           <w:color w:val="0F172A"/>
-          <w:sz w:val="21"/>
+          <w:sz w:val="20"/>
         </w:rPr>
-        <w:t>Teaching Assistant &amp; Applied AI Instructor  |  University of Ghana (Dept. of CS)</w:t>
+        <w:t>Head of IT &amp; Media Systems  |  Overcomers Nation Church (ONC)</w:t>
       </w:r>
       <w:r>
         <w:rPr>
           <w:color w:val="64748B"/>
-          <w:sz w:val="19"/>
+          <w:sz w:val="18"/>
         </w:rPr>
         <w:tab/>
-        <w:t>Ongoing</w:t>
+        <w:t>2023 – Present</w:t>
       </w:r>
     </w:p>
     <w:p>
       <w:pPr>
         <w:pStyle w:val="ListBullet"/>
-        <w:spacing w:before="0" w:after="40" w:line="276" w:lineRule="auto"/>
+        <w:spacing w:before="0" w:after="50" w:line="276" w:lineRule="auto"/>
       </w:pPr>
       <w:r>
         <w:rPr>
           <w:rFonts w:ascii="Calibri" w:hAnsi="Calibri"/>
           <w:color w:val="334155"/>
-          <w:sz w:val="20"/>
+          <w:sz w:val="19"/>
         </w:rPr>
-        <w:t>Instruct Applied AI short course covering prompt engineering, AI workflow design, and practical AI tooling.</w:t>
+        <w:t>Direct IT operations, advanced AV media broadcasting systems, and internal technical infrastructure.</w:t>
+      </w:r>
+    </w:p>
+    <w:p>
+      <w:pPr>
+        <w:pStyle w:val="ListBullet"/>
+        <w:spacing w:before="0" w:after="50" w:line="276" w:lineRule="auto"/>
+      </w:pPr>
+      <w:r>
+        <w:rPr>
+          <w:rFonts w:ascii="Calibri" w:hAnsi="Calibri"/>
+          <w:color w:val="334155"/>
+          <w:sz w:val="19"/>
+        </w:rPr>
+        <w:t>Develop custom full-stack web and mobile applications to automate administrative workflows, community engagement, and digital production.</w:t>
       </w:r>
     </w:p>
     <w:p>
@@ -422,167 +575,51 @@
         <w:rPr>
           <w:b/>
           <w:color w:val="0F172A"/>
-          <w:sz w:val="21"/>
+          <w:sz w:val="20"/>
         </w:rPr>
-        <w:t>Head, Media Systems &amp; IT Unit  |  Overcomers Nation Church</w:t>
+        <w:t>Research Assistant  |  University of Ghana</w:t>
       </w:r>
       <w:r>
         <w:rPr>
           <w:color w:val="64748B"/>
-          <w:sz w:val="19"/>
+          <w:sz w:val="18"/>
         </w:rPr>
         <w:tab/>
-        <w:t>2023 — Present</w:t>
+        <w:t>2023 – Present</w:t>
       </w:r>
     </w:p>
     <w:p>
       <w:pPr>
         <w:pStyle w:val="ListBullet"/>
-        <w:spacing w:before="0" w:after="40" w:line="276" w:lineRule="auto"/>
+        <w:spacing w:before="0" w:after="50" w:line="276" w:lineRule="auto"/>
       </w:pPr>
       <w:r>
         <w:rPr>
           <w:rFonts w:ascii="Calibri" w:hAnsi="Calibri"/>
           <w:color w:val="334155"/>
-          <w:sz w:val="20"/>
+          <w:sz w:val="19"/>
         </w:rPr>
-        <w:t>Direct broadcast and IT teams; engineered WebSocket live switching software connecting React Native to vMix at 60fps.</w:t>
+        <w:t>Conduct deep learning research under Prof. Kofi Sarpong Adu-Manu focusing on spatio-temporal graph transformer networks.</w:t>
+      </w:r>
+    </w:p>
+    <w:p>
+      <w:pPr>
+        <w:pStyle w:val="ListBullet"/>
+        <w:spacing w:before="0" w:after="50" w:line="276" w:lineRule="auto"/>
+      </w:pPr>
+      <w:r>
+        <w:rPr>
+          <w:rFonts w:ascii="Calibri" w:hAnsi="Calibri"/>
+          <w:color w:val="334155"/>
+          <w:sz w:val="19"/>
+        </w:rPr>
+        <w:t>Build automated data pipelines and evaluate model training benchmarks to support advanced AI infrastructure monitoring.</w:t>
       </w:r>
     </w:p>
     <w:p>
       <w:pPr>
         <w:keepNext/>
-        <w:spacing w:before="280" w:after="80"/>
-      </w:pPr>
-      <w:r>
-        <w:rPr>
-          <w:rFonts w:ascii="Calibri" w:hAnsi="Calibri"/>
-          <w:b/>
-          <w:color w:val="0F172A"/>
-          <w:sz w:val="22"/>
-        </w:rPr>
-        <w:t>FEATURED PROJECTS</w:t>
-      </w:r>
-    </w:p>
-    <w:p>
-      <w:pPr>
-        <w:pStyle w:val="ListBullet"/>
-        <w:spacing w:before="0" w:after="40" w:line="276" w:lineRule="auto"/>
-      </w:pPr>
-      <w:r>
-        <w:rPr>
-          <w:rFonts w:ascii="Calibri" w:hAnsi="Calibri"/>
-          <w:b/>
-          <w:color w:val="334155"/>
-          <w:sz w:val="20"/>
-        </w:rPr>
-        <w:t xml:space="preserve">StrokeNet: </w:t>
-      </w:r>
-      <w:r>
-        <w:rPr>
-          <w:rFonts w:ascii="Calibri" w:hAnsi="Calibri"/>
-          <w:color w:val="334155"/>
-          <w:sz w:val="20"/>
-        </w:rPr>
-        <w:t>Real-time stroke emergency response platform built with FastAPI, WebRTC, Socket.IO, Celery, and AWS S3.</w:t>
-      </w:r>
-    </w:p>
-    <w:p>
-      <w:pPr>
-        <w:pStyle w:val="ListBullet"/>
-        <w:spacing w:before="0" w:after="40" w:line="276" w:lineRule="auto"/>
-      </w:pPr>
-      <w:r>
-        <w:rPr>
-          <w:rFonts w:ascii="Calibri" w:hAnsi="Calibri"/>
-          <w:b/>
-          <w:color w:val="334155"/>
-          <w:sz w:val="20"/>
-        </w:rPr>
-        <w:t xml:space="preserve">VelocityPass: </w:t>
-      </w:r>
-      <w:r>
-        <w:rPr>
-          <w:rFonts w:ascii="Calibri" w:hAnsi="Calibri"/>
-          <w:color w:val="334155"/>
-          <w:sz w:val="20"/>
-        </w:rPr>
-        <w:t>High-throughput ticketing API handling 10k+ concurrent users with zero race conditions via Redis distributed locks.</w:t>
-      </w:r>
-    </w:p>
-    <w:p>
-      <w:pPr>
-        <w:pStyle w:val="ListBullet"/>
-        <w:spacing w:before="0" w:after="40" w:line="276" w:lineRule="auto"/>
-      </w:pPr>
-      <w:r>
-        <w:rPr>
-          <w:rFonts w:ascii="Calibri" w:hAnsi="Calibri"/>
-          <w:b/>
-          <w:color w:val="334155"/>
-          <w:sz w:val="20"/>
-        </w:rPr>
-        <w:t xml:space="preserve">UG SmartWallet: </w:t>
-      </w:r>
-      <w:r>
-        <w:rPr>
-          <w:rFonts w:ascii="Calibri" w:hAnsi="Calibri"/>
-          <w:color w:val="334155"/>
-          <w:sz w:val="20"/>
-        </w:rPr>
-        <w:t>Campus financial ledger with double-entry accounting, PostgreSQL row-level locks, and strict idempotency validation.</w:t>
-      </w:r>
-    </w:p>
-    <w:p>
-      <w:pPr>
-        <w:pStyle w:val="ListBullet"/>
-        <w:spacing w:before="0" w:after="40" w:line="276" w:lineRule="auto"/>
-      </w:pPr>
-      <w:r>
-        <w:rPr>
-          <w:rFonts w:ascii="Calibri" w:hAnsi="Calibri"/>
-          <w:b/>
-          <w:color w:val="334155"/>
-          <w:sz w:val="20"/>
-        </w:rPr>
-        <w:t xml:space="preserve">Dominion Media API: </w:t>
-      </w:r>
-      <w:r>
-        <w:rPr>
-          <w:rFonts w:ascii="Calibri" w:hAnsi="Calibri"/>
-          <w:color w:val="334155"/>
-          <w:sz w:val="20"/>
-        </w:rPr>
-        <w:t>Memory-efficient audio streaming engine with FastAPI async generators and AWS CloudFront presigned URLs.</w:t>
-      </w:r>
-    </w:p>
-    <w:p>
-      <w:pPr>
-        <w:pStyle w:val="ListBullet"/>
-        <w:spacing w:before="0" w:after="40" w:line="276" w:lineRule="auto"/>
-      </w:pPr>
-      <w:r>
-        <w:rPr>
-          <w:rFonts w:ascii="Calibri" w:hAnsi="Calibri"/>
-          <w:b/>
-          <w:color w:val="334155"/>
-          <w:sz w:val="20"/>
-        </w:rPr>
-        <w:t xml:space="preserve">QuantData Pipeline: </w:t>
-      </w:r>
-      <w:r>
-        <w:rPr>
-          <w:rFonts w:ascii="Calibri" w:hAnsi="Calibri"/>
-          <w:color w:val="334155"/>
-          <w:sz w:val="20"/>
-        </w:rPr>
-        <w:t>Financial ingestion pipeline streaming thousands of market ticks per second into TimescaleDB hypertables.</w:t>
-      </w:r>
-    </w:p>
-    <w:p>
-      <w:pPr>
-        <w:keepNext/>
-        <w:spacing w:before="280" w:after="80"/>
+        <w:spacing w:before="240" w:after="80"/>
       </w:pPr>
       <w:r>
         <w:rPr>
@@ -596,35 +633,256 @@
     </w:p>
     <w:p>
       <w:pPr>
-        <w:spacing w:before="80"/>
+        <w:spacing w:before="80" w:after="40"/>
       </w:pPr>
       <w:r>
         <w:rPr>
           <w:b/>
           <w:color w:val="0F172A"/>
-          <w:sz w:val="21"/>
-        </w:rPr>
-        <w:t>Bachelor of Science (BSc) in Information Technology</w:t>
-      </w:r>
-      <w:r>
-        <w:rPr>
-          <w:color w:val="334155"/>
           <w:sz w:val="20"/>
         </w:rPr>
-        <w:t xml:space="preserve">  |  University of Ghana, Legon</w:t>
+        <w:t>MSc in Financial Engineering  |  WorldQuant University (USA)</w:t>
       </w:r>
       <w:r>
         <w:rPr>
           <w:color w:val="64748B"/>
-          <w:sz w:val="19"/>
+          <w:sz w:val="18"/>
+        </w:rPr>
+        <w:tab/>
+        <w:t>Ongoing</w:t>
+      </w:r>
+    </w:p>
+    <w:p>
+      <w:pPr>
+        <w:spacing w:before="40" w:after="80"/>
+      </w:pPr>
+      <w:r>
+        <w:rPr>
+          <w:b/>
+          <w:color w:val="0F172A"/>
+          <w:sz w:val="20"/>
+        </w:rPr>
+        <w:t>BSc in Information Technology  |  University of Ghana, Legon</w:t>
+      </w:r>
+      <w:r>
+        <w:rPr>
+          <w:color w:val="64748B"/>
+          <w:sz w:val="18"/>
         </w:rPr>
         <w:tab/>
         <w:t>Graduated 2025</w:t>
       </w:r>
     </w:p>
+    <w:p>
+      <w:pPr>
+        <w:keepNext/>
+        <w:spacing w:before="240" w:after="80"/>
+      </w:pPr>
+      <w:r>
+        <w:rPr>
+          <w:rFonts w:ascii="Calibri" w:hAnsi="Calibri"/>
+          <w:b/>
+          <w:color w:val="0F172A"/>
+          <w:sz w:val="22"/>
+        </w:rPr>
+        <w:t>REFERENCES</w:t>
+      </w:r>
+    </w:p>
+    <w:tbl>
+      <w:tblPr>
+        <w:tblW w:type="auto" w:w="0"/>
+        <w:jc w:val="center"/>
+        <w:tblLayout w:type="fixed"/>
+        <w:tblLook w:firstColumn="1" w:firstRow="1" w:lastColumn="0" w:lastRow="0" w:noHBand="0" w:noVBand="1" w:val="04A0"/>
+      </w:tblPr>
+      <w:tblGrid>
+        <w:gridCol w:w="3408"/>
+        <w:gridCol w:w="3408"/>
+        <w:gridCol w:w="3408"/>
+      </w:tblGrid>
+      <w:tr>
+        <w:tc>
+          <w:tcPr>
+            <w:tcW w:type="dxa" w:w="3408"/>
+          </w:tcPr>
+          <w:p>
+            <w:r>
+              <w:rPr>
+                <w:b/>
+                <w:color w:val="0F172A"/>
+                <w:sz w:val="19"/>
+              </w:rPr>
+              <w:t>Name</w:t>
+            </w:r>
+          </w:p>
+        </w:tc>
+        <w:tc>
+          <w:tcPr>
+            <w:tcW w:type="dxa" w:w="3408"/>
+          </w:tcPr>
+          <w:p>
+            <w:r>
+              <w:rPr>
+                <w:b/>
+                <w:color w:val="0F172A"/>
+                <w:sz w:val="19"/>
+              </w:rPr>
+              <w:t>Role / Organization</w:t>
+            </w:r>
+          </w:p>
+        </w:tc>
+        <w:tc>
+          <w:tcPr>
+            <w:tcW w:type="dxa" w:w="3408"/>
+          </w:tcPr>
+          <w:p>
+            <w:r>
+              <w:rPr>
+                <w:b/>
+                <w:color w:val="0F172A"/>
+                <w:sz w:val="19"/>
+              </w:rPr>
+              <w:t>Contact Info</w:t>
+            </w:r>
+          </w:p>
+        </w:tc>
+      </w:tr>
+      <w:tr>
+        <w:tc>
+          <w:tcPr>
+            <w:tcW w:type="dxa" w:w="3408"/>
+          </w:tcPr>
+          <w:p>
+            <w:r>
+              <w:rPr>
+                <w:color w:val="334155"/>
+                <w:sz w:val="18"/>
+              </w:rPr>
+              <w:t>Professor Kofi Sarpong Adu-Manu</w:t>
+            </w:r>
+          </w:p>
+        </w:tc>
+        <w:tc>
+          <w:tcPr>
+            <w:tcW w:type="dxa" w:w="3408"/>
+          </w:tcPr>
+          <w:p>
+            <w:r>
+              <w:rPr>
+                <w:color w:val="334155"/>
+                <w:sz w:val="18"/>
+              </w:rPr>
+              <w:t>Dept. of Computer Science, University of Ghana</w:t>
+            </w:r>
+          </w:p>
+        </w:tc>
+        <w:tc>
+          <w:tcPr>
+            <w:tcW w:type="dxa" w:w="3408"/>
+          </w:tcPr>
+          <w:p>
+            <w:r>
+              <w:rPr>
+                <w:color w:val="334155"/>
+                <w:sz w:val="18"/>
+              </w:rPr>
+              <w:t>kaysarpsnr@gmail.com / 0244602374</w:t>
+            </w:r>
+          </w:p>
+        </w:tc>
+      </w:tr>
+      <w:tr>
+        <w:tc>
+          <w:tcPr>
+            <w:tcW w:type="dxa" w:w="3408"/>
+          </w:tcPr>
+          <w:p>
+            <w:r>
+              <w:rPr>
+                <w:color w:val="334155"/>
+                <w:sz w:val="18"/>
+              </w:rPr>
+              <w:t>Alex Quao, PhD</w:t>
+            </w:r>
+          </w:p>
+        </w:tc>
+        <w:tc>
+          <w:tcPr>
+            <w:tcW w:type="dxa" w:w="3408"/>
+          </w:tcPr>
+          <w:p>
+            <w:r>
+              <w:rPr>
+                <w:color w:val="334155"/>
+                <w:sz w:val="18"/>
+              </w:rPr>
+              <w:t>CEO, Aréte Forge</w:t>
+            </w:r>
+          </w:p>
+        </w:tc>
+        <w:tc>
+          <w:tcPr>
+            <w:tcW w:type="dxa" w:w="3408"/>
+          </w:tcPr>
+          <w:p>
+            <w:r>
+              <w:rPr>
+                <w:color w:val="334155"/>
+                <w:sz w:val="18"/>
+              </w:rPr>
+              <w:t>0592199757 / 0249221772</w:t>
+            </w:r>
+          </w:p>
+        </w:tc>
+      </w:tr>
+      <w:tr>
+        <w:tc>
+          <w:tcPr>
+            <w:tcW w:type="dxa" w:w="3408"/>
+          </w:tcPr>
+          <w:p>
+            <w:r>
+              <w:rPr>
+                <w:color w:val="334155"/>
+                <w:sz w:val="18"/>
+              </w:rPr>
+              <w:t>Dr. Ebenezer Okronipa</w:t>
+            </w:r>
+          </w:p>
+        </w:tc>
+        <w:tc>
+          <w:tcPr>
+            <w:tcW w:type="dxa" w:w="3408"/>
+          </w:tcPr>
+          <w:p>
+            <w:r>
+              <w:rPr>
+                <w:color w:val="334155"/>
+                <w:sz w:val="18"/>
+              </w:rPr>
+              <w:t>Pharmacist</w:t>
+            </w:r>
+          </w:p>
+        </w:tc>
+        <w:tc>
+          <w:tcPr>
+            <w:tcW w:type="dxa" w:w="3408"/>
+          </w:tcPr>
+          <w:p>
+            <w:r>
+              <w:rPr>
+                <w:color w:val="334155"/>
+                <w:sz w:val="18"/>
+              </w:rPr>
+              <w:t>0200994446</w:t>
+            </w:r>
+          </w:p>
+        </w:tc>
+      </w:tr>
+    </w:tbl>
     <w:sectPr>
       <w:pgSz w:w="12240" w:h="15840"/>
-      <w:pgMar w:top="1080" w:right="1080" w:bottom="1080" w:left="1080" w:header="720" w:footer="720" w:gutter="0"/>
+      <w:pgMar w:top="1008" w:right="1008" w:bottom="1008" w:left="1008" w:header="720" w:footer="720" w:gutter="0"/>
       <w:cols w:space="720"/>
       <w:docGrid w:linePitch="360"/>
     </w:sectPr>

</xml_diff>

<commit_message>
Restore original Word document color theme (#1F4E79, #2E75B6, #AAAAAA), typography, layout structure, and add real clickable OpenXML hyperlinks
</commit_message>
<xml_diff>
--- a/Alex_Teye_Ametepey_CV.docx
+++ b/Alex_Teye_Ametepey_CV.docx
@@ -10,7 +10,7 @@
         <w:rPr>
           <w:rFonts w:ascii="Calibri" w:hAnsi="Calibri"/>
           <w:b/>
-          <w:color w:val="0F172A"/>
+          <w:color w:val="1F4E79"/>
           <w:sz w:val="44"/>
         </w:rPr>
         <w:t>ALEX TEYE AMETEPEY</w:t>
@@ -24,7 +24,7 @@
         <w:rPr>
           <w:rFonts w:ascii="Calibri" w:hAnsi="Calibri"/>
           <w:b/>
-          <w:color w:val="D97706"/>
+          <w:color w:val="2E75B6"/>
           <w:sz w:val="24"/>
         </w:rPr>
         <w:t>Full-Stack Software Engineer &amp; Systems Architect</w:t>
@@ -32,29 +32,91 @@
     </w:p>
     <w:p>
       <w:pPr>
-        <w:spacing w:after="240"/>
+        <w:spacing w:after="280"/>
       </w:pPr>
       <w:r>
         <w:rPr>
           <w:rFonts w:ascii="Calibri" w:hAnsi="Calibri"/>
-          <w:color w:val="64748B"/>
+          <w:color w:val="595959"/>
           <w:sz w:val="19"/>
         </w:rPr>
-        <w:t>Accra, Ghana  |  0549044977  |  alexteyeametepey@gmail.com</w:t>
-        <w:br/>
-        <w:t>GitHub: github.com/aa-Teye  |  LinkedIn: linkedin.com/in/alex-ametepey-1123a3205  |  Portfolio: alex-portfolio-sooty.vercel.app</w:t>
+        <w:t xml:space="preserve">Accra, Ghana  |  0549044977  |  </w:t>
       </w:r>
+      <w:hyperlink r:id="rId9">
+        <w:r>
+          <w:rPr>
+            <w:color w:val="0563C1"/>
+            <w:u w:val="single"/>
+            <w:sz w:val="19"/>
+          </w:rPr>
+          <w:t xml:space="preserve">alexteyeametepey@gmail.com</w:t>
+        </w:r>
+      </w:hyperlink>
+      <w:r>
+        <w:rPr>
+          <w:rFonts w:ascii="Calibri" w:hAnsi="Calibri"/>
+          <w:color w:val="595959"/>
+          <w:sz w:val="19"/>
+        </w:rPr>
+        <w:t xml:space="preserve">  |  </w:t>
+      </w:r>
+      <w:hyperlink r:id="rId10">
+        <w:r>
+          <w:rPr>
+            <w:color w:val="0563C1"/>
+            <w:u w:val="single"/>
+            <w:sz w:val="19"/>
+          </w:rPr>
+          <w:t xml:space="preserve">github.com/aa-Teye</w:t>
+        </w:r>
+      </w:hyperlink>
+      <w:r>
+        <w:rPr>
+          <w:rFonts w:ascii="Calibri" w:hAnsi="Calibri"/>
+          <w:color w:val="595959"/>
+          <w:sz w:val="19"/>
+        </w:rPr>
+        <w:t xml:space="preserve">  |  </w:t>
+      </w:r>
+      <w:hyperlink r:id="rId11">
+        <w:r>
+          <w:rPr>
+            <w:color w:val="0563C1"/>
+            <w:u w:val="single"/>
+            <w:sz w:val="19"/>
+          </w:rPr>
+          <w:t xml:space="preserve">linkedin.com/in/alex-ametepey-1123a3205</w:t>
+        </w:r>
+      </w:hyperlink>
+      <w:r>
+        <w:rPr>
+          <w:rFonts w:ascii="Calibri" w:hAnsi="Calibri"/>
+          <w:color w:val="595959"/>
+          <w:sz w:val="19"/>
+        </w:rPr>
+        <w:t xml:space="preserve">  |  </w:t>
+      </w:r>
+      <w:hyperlink r:id="rId12">
+        <w:r>
+          <w:rPr>
+            <w:color w:val="0563C1"/>
+            <w:u w:val="single"/>
+            <w:sz w:val="19"/>
+          </w:rPr>
+          <w:t xml:space="preserve">alex-portfolio-sooty.vercel.app</w:t>
+        </w:r>
+      </w:hyperlink>
     </w:p>
     <w:p>
       <w:pPr>
         <w:keepNext/>
-        <w:spacing w:before="240" w:after="80"/>
+        <w:spacing w:before="280" w:after="80"/>
       </w:pPr>
       <w:r>
         <w:rPr>
           <w:rFonts w:ascii="Calibri" w:hAnsi="Calibri"/>
           <w:b/>
-          <w:color w:val="0F172A"/>
+          <w:color w:val="1F4E79"/>
           <w:sz w:val="22"/>
         </w:rPr>
         <w:t>PROFESSIONAL SUMMARY</w:t>
@@ -62,12 +124,12 @@
     </w:p>
     <w:p>
       <w:pPr>
-        <w:spacing w:after="160" w:line="276" w:lineRule="auto"/>
+        <w:spacing w:after="200" w:line="276" w:lineRule="auto"/>
       </w:pPr>
       <w:r>
         <w:rPr>
           <w:rFonts w:ascii="Calibri" w:hAnsi="Calibri"/>
-          <w:color w:val="334155"/>
+          <w:color w:val="595959"/>
           <w:sz w:val="19"/>
         </w:rPr>
         <w:t>Results-driven Full-Stack Software Engineer and Systems Architect with a strong track record of leading technical teams to deliver end-to-end enterprise platforms, mobile applications, and automated growth systems. Transitioning a background in machine learning and backend architecture into comprehensive full-stack development to solve complex operational challenges. Currently pursuing an MSc in Financial Engineering to integrate quantitative data modeling into production-grade software architectures.</w:t>
@@ -76,13 +138,13 @@
     <w:p>
       <w:pPr>
         <w:keepNext/>
-        <w:spacing w:before="240" w:after="80"/>
+        <w:spacing w:before="280" w:after="80"/>
       </w:pPr>
       <w:r>
         <w:rPr>
           <w:rFonts w:ascii="Calibri" w:hAnsi="Calibri"/>
           <w:b/>
-          <w:color w:val="0F172A"/>
+          <w:color w:val="1F4E79"/>
           <w:sz w:val="22"/>
         </w:rPr>
         <w:t>TECHNICAL SKILLS</w:t>
@@ -90,14 +152,23 @@
     </w:p>
     <w:p>
       <w:pPr>
-        <w:pStyle w:val="ListBullet"/>
-        <w:spacing w:before="0" w:after="50" w:line="276" w:lineRule="auto"/>
+        <w:pStyle w:val="ListParagraph"/>
+        <w:spacing w:before="0" w:after="60" w:line="276" w:lineRule="auto"/>
+        <w:ind w:left="360"/>
       </w:pPr>
       <w:r>
         <w:rPr>
           <w:rFonts w:ascii="Calibri" w:hAnsi="Calibri"/>
+          <w:color w:val="1F4E79"/>
+          <w:sz w:val="19"/>
+        </w:rPr>
+        <w:t xml:space="preserve">• </w:t>
+      </w:r>
+      <w:r>
+        <w:rPr>
+          <w:rFonts w:ascii="Calibri" w:hAnsi="Calibri"/>
           <w:b/>
-          <w:color w:val="334155"/>
+          <w:color w:val="1F4E79"/>
           <w:sz w:val="19"/>
         </w:rPr>
         <w:t xml:space="preserve">Languages: </w:t>
@@ -105,7 +176,7 @@
       <w:r>
         <w:rPr>
           <w:rFonts w:ascii="Calibri" w:hAnsi="Calibri"/>
-          <w:color w:val="334155"/>
+          <w:color w:val="595959"/>
           <w:sz w:val="19"/>
         </w:rPr>
         <w:t>Python, JavaScript (ES6+), Java, SQL, HTML5, CSS3</w:t>
@@ -113,14 +184,23 @@
     </w:p>
     <w:p>
       <w:pPr>
-        <w:pStyle w:val="ListBullet"/>
-        <w:spacing w:before="0" w:after="50" w:line="276" w:lineRule="auto"/>
+        <w:pStyle w:val="ListParagraph"/>
+        <w:spacing w:before="0" w:after="60" w:line="276" w:lineRule="auto"/>
+        <w:ind w:left="360"/>
       </w:pPr>
       <w:r>
         <w:rPr>
           <w:rFonts w:ascii="Calibri" w:hAnsi="Calibri"/>
+          <w:color w:val="1F4E79"/>
+          <w:sz w:val="19"/>
+        </w:rPr>
+        <w:t xml:space="preserve">• </w:t>
+      </w:r>
+      <w:r>
+        <w:rPr>
+          <w:rFonts w:ascii="Calibri" w:hAnsi="Calibri"/>
           <w:b/>
-          <w:color w:val="334155"/>
+          <w:color w:val="1F4E79"/>
           <w:sz w:val="19"/>
         </w:rPr>
         <w:t xml:space="preserve">Frontend &amp; Mobile: </w:t>
@@ -128,7 +208,7 @@
       <w:r>
         <w:rPr>
           <w:rFonts w:ascii="Calibri" w:hAnsi="Calibri"/>
-          <w:color w:val="334155"/>
+          <w:color w:val="595959"/>
           <w:sz w:val="19"/>
         </w:rPr>
         <w:t>React, Next.js, Astro, Vite, Tailwind CSS, Cross-Platform Mobile Development (React Native), Electron</w:t>
@@ -136,14 +216,23 @@
     </w:p>
     <w:p>
       <w:pPr>
-        <w:pStyle w:val="ListBullet"/>
-        <w:spacing w:before="0" w:after="50" w:line="276" w:lineRule="auto"/>
+        <w:pStyle w:val="ListParagraph"/>
+        <w:spacing w:before="0" w:after="60" w:line="276" w:lineRule="auto"/>
+        <w:ind w:left="360"/>
       </w:pPr>
       <w:r>
         <w:rPr>
           <w:rFonts w:ascii="Calibri" w:hAnsi="Calibri"/>
+          <w:color w:val="1F4E79"/>
+          <w:sz w:val="19"/>
+        </w:rPr>
+        <w:t xml:space="preserve">• </w:t>
+      </w:r>
+      <w:r>
+        <w:rPr>
+          <w:rFonts w:ascii="Calibri" w:hAnsi="Calibri"/>
           <w:b/>
-          <w:color w:val="334155"/>
+          <w:color w:val="1F4E79"/>
           <w:sz w:val="19"/>
         </w:rPr>
         <w:t xml:space="preserve">Backend &amp; Architecture: </w:t>
@@ -151,7 +240,7 @@
       <w:r>
         <w:rPr>
           <w:rFonts w:ascii="Calibri" w:hAnsi="Calibri"/>
-          <w:color w:val="334155"/>
+          <w:color w:val="595959"/>
           <w:sz w:val="19"/>
         </w:rPr>
         <w:t>FastAPI, RESTful API Design, System Design, JWT Authentication, Redis (Caching &amp; Queues)</w:t>
@@ -159,14 +248,23 @@
     </w:p>
     <w:p>
       <w:pPr>
-        <w:pStyle w:val="ListBullet"/>
-        <w:spacing w:before="0" w:after="50" w:line="276" w:lineRule="auto"/>
+        <w:pStyle w:val="ListParagraph"/>
+        <w:spacing w:before="0" w:after="60" w:line="276" w:lineRule="auto"/>
+        <w:ind w:left="360"/>
       </w:pPr>
       <w:r>
         <w:rPr>
           <w:rFonts w:ascii="Calibri" w:hAnsi="Calibri"/>
+          <w:color w:val="1F4E79"/>
+          <w:sz w:val="19"/>
+        </w:rPr>
+        <w:t xml:space="preserve">• </w:t>
+      </w:r>
+      <w:r>
+        <w:rPr>
+          <w:rFonts w:ascii="Calibri" w:hAnsi="Calibri"/>
           <w:b/>
-          <w:color w:val="334155"/>
+          <w:color w:val="1F4E79"/>
           <w:sz w:val="19"/>
         </w:rPr>
         <w:t xml:space="preserve">Databases &amp; Storage: </w:t>
@@ -174,7 +272,7 @@
       <w:r>
         <w:rPr>
           <w:rFonts w:ascii="Calibri" w:hAnsi="Calibri"/>
-          <w:color w:val="334155"/>
+          <w:color w:val="595959"/>
           <w:sz w:val="19"/>
         </w:rPr>
         <w:t>Neon (Serverless PostgreSQL), PostgreSQL, SQLite, Relational Schema Design</w:t>
@@ -182,14 +280,23 @@
     </w:p>
     <w:p>
       <w:pPr>
-        <w:pStyle w:val="ListBullet"/>
-        <w:spacing w:before="0" w:after="50" w:line="276" w:lineRule="auto"/>
+        <w:pStyle w:val="ListParagraph"/>
+        <w:spacing w:before="0" w:after="60" w:line="276" w:lineRule="auto"/>
+        <w:ind w:left="360"/>
       </w:pPr>
       <w:r>
         <w:rPr>
           <w:rFonts w:ascii="Calibri" w:hAnsi="Calibri"/>
+          <w:color w:val="1F4E79"/>
+          <w:sz w:val="19"/>
+        </w:rPr>
+        <w:t xml:space="preserve">• </w:t>
+      </w:r>
+      <w:r>
+        <w:rPr>
+          <w:rFonts w:ascii="Calibri" w:hAnsi="Calibri"/>
           <w:b/>
-          <w:color w:val="334155"/>
+          <w:color w:val="1F4E79"/>
           <w:sz w:val="19"/>
         </w:rPr>
         <w:t xml:space="preserve">DevOps &amp; Workflows: </w:t>
@@ -197,7 +304,7 @@
       <w:r>
         <w:rPr>
           <w:rFonts w:ascii="Calibri" w:hAnsi="Calibri"/>
-          <w:color w:val="334155"/>
+          <w:color w:val="595959"/>
           <w:sz w:val="19"/>
         </w:rPr>
         <w:t>Vercel, Render, Git, GitHub, Jira, Agile Sprint Planning</w:t>
@@ -205,14 +312,23 @@
     </w:p>
     <w:p>
       <w:pPr>
-        <w:pStyle w:val="ListBullet"/>
-        <w:spacing w:before="0" w:after="50" w:line="276" w:lineRule="auto"/>
+        <w:pStyle w:val="ListParagraph"/>
+        <w:spacing w:before="0" w:after="60" w:line="276" w:lineRule="auto"/>
+        <w:ind w:left="360"/>
       </w:pPr>
       <w:r>
         <w:rPr>
           <w:rFonts w:ascii="Calibri" w:hAnsi="Calibri"/>
+          <w:color w:val="1F4E79"/>
+          <w:sz w:val="19"/>
+        </w:rPr>
+        <w:t xml:space="preserve">• </w:t>
+      </w:r>
+      <w:r>
+        <w:rPr>
+          <w:rFonts w:ascii="Calibri" w:hAnsi="Calibri"/>
           <w:b/>
-          <w:color w:val="334155"/>
+          <w:color w:val="1F4E79"/>
           <w:sz w:val="19"/>
         </w:rPr>
         <w:t xml:space="preserve">Media Systems: </w:t>
@@ -220,7 +336,7 @@
       <w:r>
         <w:rPr>
           <w:rFonts w:ascii="Calibri" w:hAnsi="Calibri"/>
-          <w:color w:val="334155"/>
+          <w:color w:val="595959"/>
           <w:sz w:val="19"/>
         </w:rPr>
         <w:t>Live Broadcast Routing (vMix)</w:t>
@@ -229,13 +345,13 @@
     <w:p>
       <w:pPr>
         <w:keepNext/>
-        <w:spacing w:before="240" w:after="80"/>
+        <w:spacing w:before="280" w:after="80"/>
       </w:pPr>
       <w:r>
         <w:rPr>
           <w:rFonts w:ascii="Calibri" w:hAnsi="Calibri"/>
           <w:b/>
-          <w:color w:val="0F172A"/>
+          <w:color w:val="1F4E79"/>
           <w:sz w:val="22"/>
         </w:rPr>
         <w:t>KEY FULL-STACK &amp; SYSTEM ARCHITECTURE PROJECTS</w:t>
@@ -243,14 +359,23 @@
     </w:p>
     <w:p>
       <w:pPr>
-        <w:pStyle w:val="ListBullet"/>
-        <w:spacing w:before="0" w:after="50" w:line="276" w:lineRule="auto"/>
+        <w:pStyle w:val="ListParagraph"/>
+        <w:spacing w:before="0" w:after="60" w:line="276" w:lineRule="auto"/>
+        <w:ind w:left="360"/>
       </w:pPr>
       <w:r>
         <w:rPr>
           <w:rFonts w:ascii="Calibri" w:hAnsi="Calibri"/>
+          <w:color w:val="1F4E79"/>
+          <w:sz w:val="19"/>
+        </w:rPr>
+        <w:t xml:space="preserve">• </w:t>
+      </w:r>
+      <w:r>
+        <w:rPr>
+          <w:rFonts w:ascii="Calibri" w:hAnsi="Calibri"/>
           <w:b/>
-          <w:color w:val="334155"/>
+          <w:color w:val="1F4E79"/>
           <w:sz w:val="19"/>
         </w:rPr>
         <w:t xml:space="preserve">Ghana HIVdr Platform (Ongoing): </w:t>
@@ -258,7 +383,7 @@
       <w:r>
         <w:rPr>
           <w:rFonts w:ascii="Calibri" w:hAnsi="Calibri"/>
-          <w:color w:val="334155"/>
+          <w:color w:val="595959"/>
           <w:sz w:val="19"/>
         </w:rPr>
         <w:t>Lead the full-stack architecture and data synchronization pipelines for secure, real-time health-tech reporting and record tracking.</w:t>
@@ -266,14 +391,23 @@
     </w:p>
     <w:p>
       <w:pPr>
-        <w:pStyle w:val="ListBullet"/>
-        <w:spacing w:before="0" w:after="50" w:line="276" w:lineRule="auto"/>
+        <w:pStyle w:val="ListParagraph"/>
+        <w:spacing w:before="0" w:after="60" w:line="276" w:lineRule="auto"/>
+        <w:ind w:left="360"/>
       </w:pPr>
       <w:r>
         <w:rPr>
           <w:rFonts w:ascii="Calibri" w:hAnsi="Calibri"/>
+          <w:color w:val="1F4E79"/>
+          <w:sz w:val="19"/>
+        </w:rPr>
+        <w:t xml:space="preserve">• </w:t>
+      </w:r>
+      <w:r>
+        <w:rPr>
+          <w:rFonts w:ascii="Calibri" w:hAnsi="Calibri"/>
           <w:b/>
-          <w:color w:val="334155"/>
+          <w:color w:val="1F4E79"/>
           <w:sz w:val="19"/>
         </w:rPr>
         <w:t xml:space="preserve">Enterprise ERP &amp; Custom CMS Solutions: </w:t>
@@ -281,7 +415,7 @@
       <w:r>
         <w:rPr>
           <w:rFonts w:ascii="Calibri" w:hAnsi="Calibri"/>
-          <w:color w:val="334155"/>
+          <w:color w:val="595959"/>
           <w:sz w:val="19"/>
         </w:rPr>
         <w:t>Architected multi-tenant database schemas, automated operational workflows, and role-based access control (RBAC) systems across diverse client requirements.</w:t>
@@ -289,14 +423,23 @@
     </w:p>
     <w:p>
       <w:pPr>
-        <w:pStyle w:val="ListBullet"/>
-        <w:spacing w:before="0" w:after="50" w:line="276" w:lineRule="auto"/>
+        <w:pStyle w:val="ListParagraph"/>
+        <w:spacing w:before="0" w:after="60" w:line="276" w:lineRule="auto"/>
+        <w:ind w:left="360"/>
       </w:pPr>
       <w:r>
         <w:rPr>
           <w:rFonts w:ascii="Calibri" w:hAnsi="Calibri"/>
+          <w:color w:val="1F4E79"/>
+          <w:sz w:val="19"/>
+        </w:rPr>
+        <w:t xml:space="preserve">• </w:t>
+      </w:r>
+      <w:r>
+        <w:rPr>
+          <w:rFonts w:ascii="Calibri" w:hAnsi="Calibri"/>
           <w:b/>
-          <w:color w:val="334155"/>
+          <w:color w:val="1F4E79"/>
           <w:sz w:val="19"/>
         </w:rPr>
         <w:t xml:space="preserve">Automated Examination Management System: </w:t>
@@ -304,7 +447,7 @@
       <w:r>
         <w:rPr>
           <w:rFonts w:ascii="Calibri" w:hAnsi="Calibri"/>
-          <w:color w:val="334155"/>
+          <w:color w:val="595959"/>
           <w:sz w:val="19"/>
         </w:rPr>
         <w:t>Built a secure assessment engine supporting automated grading logic, audit logging, and encrypted academic record handling.</w:t>
@@ -312,14 +455,23 @@
     </w:p>
     <w:p>
       <w:pPr>
-        <w:pStyle w:val="ListBullet"/>
-        <w:spacing w:before="0" w:after="50" w:line="276" w:lineRule="auto"/>
+        <w:pStyle w:val="ListParagraph"/>
+        <w:spacing w:before="0" w:after="60" w:line="276" w:lineRule="auto"/>
+        <w:ind w:left="360"/>
       </w:pPr>
       <w:r>
         <w:rPr>
           <w:rFonts w:ascii="Calibri" w:hAnsi="Calibri"/>
+          <w:color w:val="1F4E79"/>
+          <w:sz w:val="19"/>
+        </w:rPr>
+        <w:t xml:space="preserve">• </w:t>
+      </w:r>
+      <w:r>
+        <w:rPr>
+          <w:rFonts w:ascii="Calibri" w:hAnsi="Calibri"/>
           <w:b/>
-          <w:color w:val="334155"/>
+          <w:color w:val="1F4E79"/>
           <w:sz w:val="19"/>
         </w:rPr>
         <w:t xml:space="preserve">Church Management &amp; Operations System (SPS): </w:t>
@@ -327,7 +479,7 @@
       <w:r>
         <w:rPr>
           <w:rFonts w:ascii="Calibri" w:hAnsi="Calibri"/>
-          <w:color w:val="334155"/>
+          <w:color w:val="595959"/>
           <w:sz w:val="19"/>
         </w:rPr>
         <w:t>Engineered an integrated platform for database administration, member tracking, and automated service coordination.</w:t>
@@ -335,14 +487,23 @@
     </w:p>
     <w:p>
       <w:pPr>
-        <w:pStyle w:val="ListBullet"/>
-        <w:spacing w:before="0" w:after="50" w:line="276" w:lineRule="auto"/>
+        <w:pStyle w:val="ListParagraph"/>
+        <w:spacing w:before="0" w:after="60" w:line="276" w:lineRule="auto"/>
+        <w:ind w:left="360"/>
       </w:pPr>
       <w:r>
         <w:rPr>
           <w:rFonts w:ascii="Calibri" w:hAnsi="Calibri"/>
+          <w:color w:val="1F4E79"/>
+          <w:sz w:val="19"/>
+        </w:rPr>
+        <w:t xml:space="preserve">• </w:t>
+      </w:r>
+      <w:r>
+        <w:rPr>
+          <w:rFonts w:ascii="Calibri" w:hAnsi="Calibri"/>
           <w:b/>
-          <w:color w:val="334155"/>
+          <w:color w:val="1F4E79"/>
           <w:sz w:val="19"/>
         </w:rPr>
         <w:t xml:space="preserve">UGDS System: </w:t>
@@ -350,7 +511,7 @@
       <w:r>
         <w:rPr>
           <w:rFonts w:ascii="Calibri" w:hAnsi="Calibri"/>
-          <w:color w:val="334155"/>
+          <w:color w:val="595959"/>
           <w:sz w:val="19"/>
         </w:rPr>
         <w:t>Led the complete full-stack architecture, API endpoint specifications, and database performance optimization as Lead Engineer and Full-Stack Developer.</w:t>
@@ -359,13 +520,13 @@
     <w:p>
       <w:pPr>
         <w:keepNext/>
-        <w:spacing w:before="240" w:after="80"/>
+        <w:spacing w:before="280" w:after="80"/>
       </w:pPr>
       <w:r>
         <w:rPr>
           <w:rFonts w:ascii="Calibri" w:hAnsi="Calibri"/>
           <w:b/>
-          <w:color w:val="0F172A"/>
+          <w:color w:val="1F4E79"/>
           <w:sz w:val="22"/>
         </w:rPr>
         <w:t>PROFESSIONAL EXPERIENCE</w:t>
@@ -373,19 +534,39 @@
     </w:p>
     <w:p>
       <w:pPr>
+        <w:keepNext/>
         <w:spacing w:before="120" w:after="40"/>
       </w:pPr>
       <w:r>
         <w:rPr>
+          <w:rFonts w:ascii="Calibri" w:hAnsi="Calibri"/>
           <w:b/>
-          <w:color w:val="0F172A"/>
+          <w:color w:val="1F4E79"/>
           <w:sz w:val="20"/>
         </w:rPr>
-        <w:t>Software Developer (Contract)  |  Aréte Forge</w:t>
+        <w:t>Software Developer (Contract)</w:t>
       </w:r>
       <w:r>
         <w:rPr>
-          <w:color w:val="64748B"/>
+          <w:rFonts w:ascii="Calibri" w:hAnsi="Calibri"/>
+          <w:color w:val="AAAAAA"/>
+          <w:sz w:val="20"/>
+        </w:rPr>
+        <w:t xml:space="preserve">  |  </w:t>
+      </w:r>
+      <w:r>
+        <w:rPr>
+          <w:rFonts w:ascii="Calibri" w:hAnsi="Calibri"/>
+          <w:b/>
+          <w:color w:val="2E75B6"/>
+          <w:sz w:val="20"/>
+        </w:rPr>
+        <w:t>Aréte Forge</w:t>
+      </w:r>
+      <w:r>
+        <w:rPr>
+          <w:rFonts w:ascii="Calibri" w:hAnsi="Calibri"/>
+          <w:color w:val="595959"/>
           <w:sz w:val="18"/>
         </w:rPr>
         <w:tab/>
@@ -394,13 +575,22 @@
     </w:p>
     <w:p>
       <w:pPr>
-        <w:pStyle w:val="ListBullet"/>
-        <w:spacing w:before="0" w:after="50" w:line="276" w:lineRule="auto"/>
+        <w:pStyle w:val="ListParagraph"/>
+        <w:spacing w:before="0" w:after="60" w:line="276" w:lineRule="auto"/>
+        <w:ind w:left="360"/>
       </w:pPr>
       <w:r>
         <w:rPr>
           <w:rFonts w:ascii="Calibri" w:hAnsi="Calibri"/>
-          <w:color w:val="334155"/>
+          <w:color w:val="1F4E79"/>
+          <w:sz w:val="19"/>
+        </w:rPr>
+        <w:t xml:space="preserve">• </w:t>
+      </w:r>
+      <w:r>
+        <w:rPr>
+          <w:rFonts w:ascii="Calibri" w:hAnsi="Calibri"/>
+          <w:color w:val="595959"/>
           <w:sz w:val="19"/>
         </w:rPr>
         <w:t>Architect and deploy comprehensive full-stack solutions, engineering seamless experiences from responsive web platforms to mobile applications.</w:t>
@@ -408,13 +598,22 @@
     </w:p>
     <w:p>
       <w:pPr>
-        <w:pStyle w:val="ListBullet"/>
-        <w:spacing w:before="0" w:after="50" w:line="276" w:lineRule="auto"/>
+        <w:pStyle w:val="ListParagraph"/>
+        <w:spacing w:before="0" w:after="60" w:line="276" w:lineRule="auto"/>
+        <w:ind w:left="360"/>
       </w:pPr>
       <w:r>
         <w:rPr>
           <w:rFonts w:ascii="Calibri" w:hAnsi="Calibri"/>
-          <w:color w:val="334155"/>
+          <w:color w:val="1F4E79"/>
+          <w:sz w:val="19"/>
+        </w:rPr>
+        <w:t xml:space="preserve">• </w:t>
+      </w:r>
+      <w:r>
+        <w:rPr>
+          <w:rFonts w:ascii="Calibri" w:hAnsi="Calibri"/>
+          <w:color w:val="595959"/>
           <w:sz w:val="19"/>
         </w:rPr>
         <w:t>Maintain modular backend microservices using Python and FastAPI, bridging APIs with modern frontend interfaces.</w:t>
@@ -422,19 +621,39 @@
     </w:p>
     <w:p>
       <w:pPr>
+        <w:keepNext/>
         <w:spacing w:before="120" w:after="40"/>
       </w:pPr>
       <w:r>
         <w:rPr>
+          <w:rFonts w:ascii="Calibri" w:hAnsi="Calibri"/>
           <w:b/>
-          <w:color w:val="0F172A"/>
+          <w:color w:val="1F4E79"/>
           <w:sz w:val="20"/>
         </w:rPr>
-        <w:t>Backend Developer (Contract)  |  Meditel</w:t>
+        <w:t>Backend Developer (Contract)</w:t>
       </w:r>
       <w:r>
         <w:rPr>
-          <w:color w:val="64748B"/>
+          <w:rFonts w:ascii="Calibri" w:hAnsi="Calibri"/>
+          <w:color w:val="AAAAAA"/>
+          <w:sz w:val="20"/>
+        </w:rPr>
+        <w:t xml:space="preserve">  |  </w:t>
+      </w:r>
+      <w:r>
+        <w:rPr>
+          <w:rFonts w:ascii="Calibri" w:hAnsi="Calibri"/>
+          <w:b/>
+          <w:color w:val="2E75B6"/>
+          <w:sz w:val="20"/>
+        </w:rPr>
+        <w:t>Meditel</w:t>
+      </w:r>
+      <w:r>
+        <w:rPr>
+          <w:rFonts w:ascii="Calibri" w:hAnsi="Calibri"/>
+          <w:color w:val="595959"/>
           <w:sz w:val="18"/>
         </w:rPr>
         <w:tab/>
@@ -443,13 +662,22 @@
     </w:p>
     <w:p>
       <w:pPr>
-        <w:pStyle w:val="ListBullet"/>
-        <w:spacing w:before="0" w:after="50" w:line="276" w:lineRule="auto"/>
+        <w:pStyle w:val="ListParagraph"/>
+        <w:spacing w:before="0" w:after="60" w:line="276" w:lineRule="auto"/>
+        <w:ind w:left="360"/>
       </w:pPr>
       <w:r>
         <w:rPr>
           <w:rFonts w:ascii="Calibri" w:hAnsi="Calibri"/>
-          <w:color w:val="334155"/>
+          <w:color w:val="1F4E79"/>
+          <w:sz w:val="19"/>
+        </w:rPr>
+        <w:t xml:space="preserve">• </w:t>
+      </w:r>
+      <w:r>
+        <w:rPr>
+          <w:rFonts w:ascii="Calibri" w:hAnsi="Calibri"/>
+          <w:color w:val="595959"/>
           <w:sz w:val="19"/>
         </w:rPr>
         <w:t>Design and deploy secure RESTful endpoints and high-performance backend services using Python and FastAPI.</w:t>
@@ -457,13 +685,22 @@
     </w:p>
     <w:p>
       <w:pPr>
-        <w:pStyle w:val="ListBullet"/>
-        <w:spacing w:before="0" w:after="50" w:line="276" w:lineRule="auto"/>
+        <w:pStyle w:val="ListParagraph"/>
+        <w:spacing w:before="0" w:after="60" w:line="276" w:lineRule="auto"/>
+        <w:ind w:left="360"/>
       </w:pPr>
       <w:r>
         <w:rPr>
           <w:rFonts w:ascii="Calibri" w:hAnsi="Calibri"/>
-          <w:color w:val="334155"/>
+          <w:color w:val="1F4E79"/>
+          <w:sz w:val="19"/>
+        </w:rPr>
+        <w:t xml:space="preserve">• </w:t>
+      </w:r>
+      <w:r>
+        <w:rPr>
+          <w:rFonts w:ascii="Calibri" w:hAnsi="Calibri"/>
+          <w:color w:val="595959"/>
           <w:sz w:val="19"/>
         </w:rPr>
         <w:t>Collaborate closely with frontend engineers to integrate backend services seamlessly into React-based applications.</w:t>
@@ -471,19 +708,39 @@
     </w:p>
     <w:p>
       <w:pPr>
+        <w:keepNext/>
         <w:spacing w:before="120" w:after="40"/>
       </w:pPr>
       <w:r>
         <w:rPr>
+          <w:rFonts w:ascii="Calibri" w:hAnsi="Calibri"/>
           <w:b/>
-          <w:color w:val="0F172A"/>
+          <w:color w:val="1F4E79"/>
           <w:sz w:val="20"/>
         </w:rPr>
-        <w:t>Growth Engineer (Contract)  |  WAICA</w:t>
+        <w:t>Growth Engineer (Contract)</w:t>
       </w:r>
       <w:r>
         <w:rPr>
-          <w:color w:val="64748B"/>
+          <w:rFonts w:ascii="Calibri" w:hAnsi="Calibri"/>
+          <w:color w:val="AAAAAA"/>
+          <w:sz w:val="20"/>
+        </w:rPr>
+        <w:t xml:space="preserve">  |  </w:t>
+      </w:r>
+      <w:r>
+        <w:rPr>
+          <w:rFonts w:ascii="Calibri" w:hAnsi="Calibri"/>
+          <w:b/>
+          <w:color w:val="2E75B6"/>
+          <w:sz w:val="20"/>
+        </w:rPr>
+        <w:t>WAICA</w:t>
+      </w:r>
+      <w:r>
+        <w:rPr>
+          <w:rFonts w:ascii="Calibri" w:hAnsi="Calibri"/>
+          <w:color w:val="595959"/>
           <w:sz w:val="18"/>
         </w:rPr>
         <w:tab/>
@@ -492,13 +749,22 @@
     </w:p>
     <w:p>
       <w:pPr>
-        <w:pStyle w:val="ListBullet"/>
-        <w:spacing w:before="0" w:after="50" w:line="276" w:lineRule="auto"/>
+        <w:pStyle w:val="ListParagraph"/>
+        <w:spacing w:before="0" w:after="60" w:line="276" w:lineRule="auto"/>
+        <w:ind w:left="360"/>
       </w:pPr>
       <w:r>
         <w:rPr>
           <w:rFonts w:ascii="Calibri" w:hAnsi="Calibri"/>
-          <w:color w:val="334155"/>
+          <w:color w:val="1F4E79"/>
+          <w:sz w:val="19"/>
+        </w:rPr>
+        <w:t xml:space="preserve">• </w:t>
+      </w:r>
+      <w:r>
+        <w:rPr>
+          <w:rFonts w:ascii="Calibri" w:hAnsi="Calibri"/>
+          <w:color w:val="595959"/>
           <w:sz w:val="19"/>
         </w:rPr>
         <w:t>Design and implement automated customer acquisition funnels, technical marketing systems, and digital growth campaigns.</w:t>
@@ -506,13 +772,22 @@
     </w:p>
     <w:p>
       <w:pPr>
-        <w:pStyle w:val="ListBullet"/>
-        <w:spacing w:before="0" w:after="50" w:line="276" w:lineRule="auto"/>
+        <w:pStyle w:val="ListParagraph"/>
+        <w:spacing w:before="0" w:after="60" w:line="276" w:lineRule="auto"/>
+        <w:ind w:left="360"/>
       </w:pPr>
       <w:r>
         <w:rPr>
           <w:rFonts w:ascii="Calibri" w:hAnsi="Calibri"/>
-          <w:color w:val="334155"/>
+          <w:color w:val="1F4E79"/>
+          <w:sz w:val="19"/>
+        </w:rPr>
+        <w:t xml:space="preserve">• </w:t>
+      </w:r>
+      <w:r>
+        <w:rPr>
+          <w:rFonts w:ascii="Calibri" w:hAnsi="Calibri"/>
+          <w:color w:val="595959"/>
           <w:sz w:val="19"/>
         </w:rPr>
         <w:t>Leverage data analytics and automation tools to optimize conversion rates and expand digital brand presence.</w:t>
@@ -520,19 +795,39 @@
     </w:p>
     <w:p>
       <w:pPr>
+        <w:keepNext/>
         <w:spacing w:before="120" w:after="40"/>
       </w:pPr>
       <w:r>
         <w:rPr>
+          <w:rFonts w:ascii="Calibri" w:hAnsi="Calibri"/>
           <w:b/>
-          <w:color w:val="0F172A"/>
+          <w:color w:val="1F4E79"/>
           <w:sz w:val="20"/>
         </w:rPr>
-        <w:t>Head of IT &amp; Media Systems  |  Overcomers Nation Church (ONC)</w:t>
+        <w:t>Head of IT &amp; Media Systems</w:t>
       </w:r>
       <w:r>
         <w:rPr>
-          <w:color w:val="64748B"/>
+          <w:rFonts w:ascii="Calibri" w:hAnsi="Calibri"/>
+          <w:color w:val="AAAAAA"/>
+          <w:sz w:val="20"/>
+        </w:rPr>
+        <w:t xml:space="preserve">  |  </w:t>
+      </w:r>
+      <w:r>
+        <w:rPr>
+          <w:rFonts w:ascii="Calibri" w:hAnsi="Calibri"/>
+          <w:b/>
+          <w:color w:val="2E75B6"/>
+          <w:sz w:val="20"/>
+        </w:rPr>
+        <w:t>Overcomers Nation Church (ONC)</w:t>
+      </w:r>
+      <w:r>
+        <w:rPr>
+          <w:rFonts w:ascii="Calibri" w:hAnsi="Calibri"/>
+          <w:color w:val="595959"/>
           <w:sz w:val="18"/>
         </w:rPr>
         <w:tab/>
@@ -541,13 +836,22 @@
     </w:p>
     <w:p>
       <w:pPr>
-        <w:pStyle w:val="ListBullet"/>
-        <w:spacing w:before="0" w:after="50" w:line="276" w:lineRule="auto"/>
+        <w:pStyle w:val="ListParagraph"/>
+        <w:spacing w:before="0" w:after="60" w:line="276" w:lineRule="auto"/>
+        <w:ind w:left="360"/>
       </w:pPr>
       <w:r>
         <w:rPr>
           <w:rFonts w:ascii="Calibri" w:hAnsi="Calibri"/>
-          <w:color w:val="334155"/>
+          <w:color w:val="1F4E79"/>
+          <w:sz w:val="19"/>
+        </w:rPr>
+        <w:t xml:space="preserve">• </w:t>
+      </w:r>
+      <w:r>
+        <w:rPr>
+          <w:rFonts w:ascii="Calibri" w:hAnsi="Calibri"/>
+          <w:color w:val="595959"/>
           <w:sz w:val="19"/>
         </w:rPr>
         <w:t>Direct IT operations, advanced AV media broadcasting systems, and internal technical infrastructure.</w:t>
@@ -555,13 +859,22 @@
     </w:p>
     <w:p>
       <w:pPr>
-        <w:pStyle w:val="ListBullet"/>
-        <w:spacing w:before="0" w:after="50" w:line="276" w:lineRule="auto"/>
+        <w:pStyle w:val="ListParagraph"/>
+        <w:spacing w:before="0" w:after="60" w:line="276" w:lineRule="auto"/>
+        <w:ind w:left="360"/>
       </w:pPr>
       <w:r>
         <w:rPr>
           <w:rFonts w:ascii="Calibri" w:hAnsi="Calibri"/>
-          <w:color w:val="334155"/>
+          <w:color w:val="1F4E79"/>
+          <w:sz w:val="19"/>
+        </w:rPr>
+        <w:t xml:space="preserve">• </w:t>
+      </w:r>
+      <w:r>
+        <w:rPr>
+          <w:rFonts w:ascii="Calibri" w:hAnsi="Calibri"/>
+          <w:color w:val="595959"/>
           <w:sz w:val="19"/>
         </w:rPr>
         <w:t>Develop custom full-stack web and mobile applications to automate administrative workflows, community engagement, and digital production.</w:t>
@@ -569,19 +882,39 @@
     </w:p>
     <w:p>
       <w:pPr>
+        <w:keepNext/>
         <w:spacing w:before="120" w:after="40"/>
       </w:pPr>
       <w:r>
         <w:rPr>
+          <w:rFonts w:ascii="Calibri" w:hAnsi="Calibri"/>
           <w:b/>
-          <w:color w:val="0F172A"/>
+          <w:color w:val="1F4E79"/>
           <w:sz w:val="20"/>
         </w:rPr>
-        <w:t>Research Assistant  |  University of Ghana</w:t>
+        <w:t>Research Assistant</w:t>
       </w:r>
       <w:r>
         <w:rPr>
-          <w:color w:val="64748B"/>
+          <w:rFonts w:ascii="Calibri" w:hAnsi="Calibri"/>
+          <w:color w:val="AAAAAA"/>
+          <w:sz w:val="20"/>
+        </w:rPr>
+        <w:t xml:space="preserve">  |  </w:t>
+      </w:r>
+      <w:r>
+        <w:rPr>
+          <w:rFonts w:ascii="Calibri" w:hAnsi="Calibri"/>
+          <w:b/>
+          <w:color w:val="2E75B6"/>
+          <w:sz w:val="20"/>
+        </w:rPr>
+        <w:t>University of Ghana</w:t>
+      </w:r>
+      <w:r>
+        <w:rPr>
+          <w:rFonts w:ascii="Calibri" w:hAnsi="Calibri"/>
+          <w:color w:val="595959"/>
           <w:sz w:val="18"/>
         </w:rPr>
         <w:tab/>
@@ -590,13 +923,22 @@
     </w:p>
     <w:p>
       <w:pPr>
-        <w:pStyle w:val="ListBullet"/>
-        <w:spacing w:before="0" w:after="50" w:line="276" w:lineRule="auto"/>
+        <w:pStyle w:val="ListParagraph"/>
+        <w:spacing w:before="0" w:after="60" w:line="276" w:lineRule="auto"/>
+        <w:ind w:left="360"/>
       </w:pPr>
       <w:r>
         <w:rPr>
           <w:rFonts w:ascii="Calibri" w:hAnsi="Calibri"/>
-          <w:color w:val="334155"/>
+          <w:color w:val="1F4E79"/>
+          <w:sz w:val="19"/>
+        </w:rPr>
+        <w:t xml:space="preserve">• </w:t>
+      </w:r>
+      <w:r>
+        <w:rPr>
+          <w:rFonts w:ascii="Calibri" w:hAnsi="Calibri"/>
+          <w:color w:val="595959"/>
           <w:sz w:val="19"/>
         </w:rPr>
         <w:t>Conduct deep learning research under Prof. Kofi Sarpong Adu-Manu focusing on spatio-temporal graph transformer networks.</w:t>
@@ -604,13 +946,22 @@
     </w:p>
     <w:p>
       <w:pPr>
-        <w:pStyle w:val="ListBullet"/>
-        <w:spacing w:before="0" w:after="50" w:line="276" w:lineRule="auto"/>
+        <w:pStyle w:val="ListParagraph"/>
+        <w:spacing w:before="0" w:after="60" w:line="276" w:lineRule="auto"/>
+        <w:ind w:left="360"/>
       </w:pPr>
       <w:r>
         <w:rPr>
           <w:rFonts w:ascii="Calibri" w:hAnsi="Calibri"/>
-          <w:color w:val="334155"/>
+          <w:color w:val="1F4E79"/>
+          <w:sz w:val="19"/>
+        </w:rPr>
+        <w:t xml:space="preserve">• </w:t>
+      </w:r>
+      <w:r>
+        <w:rPr>
+          <w:rFonts w:ascii="Calibri" w:hAnsi="Calibri"/>
+          <w:color w:val="595959"/>
           <w:sz w:val="19"/>
         </w:rPr>
         <w:t>Build automated data pipelines and evaluate model training benchmarks to support advanced AI infrastructure monitoring.</w:t>
@@ -619,13 +970,13 @@
     <w:p>
       <w:pPr>
         <w:keepNext/>
-        <w:spacing w:before="240" w:after="80"/>
+        <w:spacing w:before="280" w:after="80"/>
       </w:pPr>
       <w:r>
         <w:rPr>
           <w:rFonts w:ascii="Calibri" w:hAnsi="Calibri"/>
           <w:b/>
-          <w:color w:val="0F172A"/>
+          <w:color w:val="1F4E79"/>
           <w:sz w:val="22"/>
         </w:rPr>
         <w:t>EDUCATION</w:t>
@@ -637,15 +988,32 @@
       </w:pPr>
       <w:r>
         <w:rPr>
+          <w:rFonts w:ascii="Calibri" w:hAnsi="Calibri"/>
           <w:b/>
-          <w:color w:val="0F172A"/>
+          <w:color w:val="1F4E79"/>
           <w:sz w:val="20"/>
         </w:rPr>
-        <w:t>MSc in Financial Engineering  |  WorldQuant University (USA)</w:t>
+        <w:t>MSc in Financial Engineering</w:t>
       </w:r>
       <w:r>
         <w:rPr>
-          <w:color w:val="64748B"/>
+          <w:rFonts w:ascii="Calibri" w:hAnsi="Calibri"/>
+          <w:color w:val="AAAAAA"/>
+        </w:rPr>
+        <w:t xml:space="preserve">  |  </w:t>
+      </w:r>
+      <w:r>
+        <w:rPr>
+          <w:rFonts w:ascii="Calibri" w:hAnsi="Calibri"/>
+          <w:color w:val="595959"/>
+          <w:sz w:val="20"/>
+        </w:rPr>
+        <w:t>WorldQuant University (USA)</w:t>
+      </w:r>
+      <w:r>
+        <w:rPr>
+          <w:rFonts w:ascii="Calibri" w:hAnsi="Calibri"/>
+          <w:color w:val="595959"/>
           <w:sz w:val="18"/>
         </w:rPr>
         <w:tab/>
@@ -654,19 +1022,36 @@
     </w:p>
     <w:p>
       <w:pPr>
-        <w:spacing w:before="40" w:after="80"/>
+        <w:spacing w:before="80" w:after="40"/>
       </w:pPr>
       <w:r>
         <w:rPr>
+          <w:rFonts w:ascii="Calibri" w:hAnsi="Calibri"/>
           <w:b/>
-          <w:color w:val="0F172A"/>
+          <w:color w:val="1F4E79"/>
           <w:sz w:val="20"/>
         </w:rPr>
-        <w:t>BSc in Information Technology  |  University of Ghana, Legon</w:t>
+        <w:t>BSc in Information Technology</w:t>
       </w:r>
       <w:r>
         <w:rPr>
-          <w:color w:val="64748B"/>
+          <w:rFonts w:ascii="Calibri" w:hAnsi="Calibri"/>
+          <w:color w:val="AAAAAA"/>
+        </w:rPr>
+        <w:t xml:space="preserve">  |  </w:t>
+      </w:r>
+      <w:r>
+        <w:rPr>
+          <w:rFonts w:ascii="Calibri" w:hAnsi="Calibri"/>
+          <w:color w:val="595959"/>
+          <w:sz w:val="20"/>
+        </w:rPr>
+        <w:t>University of Ghana, Legon</w:t>
+      </w:r>
+      <w:r>
+        <w:rPr>
+          <w:rFonts w:ascii="Calibri" w:hAnsi="Calibri"/>
+          <w:color w:val="595959"/>
           <w:sz w:val="18"/>
         </w:rPr>
         <w:tab/>
@@ -676,213 +1061,105 @@
     <w:p>
       <w:pPr>
         <w:keepNext/>
-        <w:spacing w:before="240" w:after="80"/>
+        <w:spacing w:before="280" w:after="80"/>
       </w:pPr>
       <w:r>
         <w:rPr>
           <w:rFonts w:ascii="Calibri" w:hAnsi="Calibri"/>
           <w:b/>
-          <w:color w:val="0F172A"/>
+          <w:color w:val="1F4E79"/>
           <w:sz w:val="22"/>
         </w:rPr>
         <w:t>REFERENCES</w:t>
       </w:r>
     </w:p>
-    <w:tbl>
-      <w:tblPr>
-        <w:tblW w:type="auto" w:w="0"/>
-        <w:jc w:val="center"/>
-        <w:tblLayout w:type="fixed"/>
-        <w:tblLook w:firstColumn="1" w:firstRow="1" w:lastColumn="0" w:lastRow="0" w:noHBand="0" w:noVBand="1" w:val="04A0"/>
-      </w:tblPr>
-      <w:tblGrid>
-        <w:gridCol w:w="3408"/>
-        <w:gridCol w:w="3408"/>
-        <w:gridCol w:w="3408"/>
-      </w:tblGrid>
-      <w:tr>
-        <w:tc>
-          <w:tcPr>
-            <w:tcW w:type="dxa" w:w="3408"/>
-          </w:tcPr>
-          <w:p>
-            <w:r>
-              <w:rPr>
-                <w:b/>
-                <w:color w:val="0F172A"/>
-                <w:sz w:val="19"/>
-              </w:rPr>
-              <w:t>Name</w:t>
-            </w:r>
-          </w:p>
-        </w:tc>
-        <w:tc>
-          <w:tcPr>
-            <w:tcW w:type="dxa" w:w="3408"/>
-          </w:tcPr>
-          <w:p>
-            <w:r>
-              <w:rPr>
-                <w:b/>
-                <w:color w:val="0F172A"/>
-                <w:sz w:val="19"/>
-              </w:rPr>
-              <w:t>Role / Organization</w:t>
-            </w:r>
-          </w:p>
-        </w:tc>
-        <w:tc>
-          <w:tcPr>
-            <w:tcW w:type="dxa" w:w="3408"/>
-          </w:tcPr>
-          <w:p>
-            <w:r>
-              <w:rPr>
-                <w:b/>
-                <w:color w:val="0F172A"/>
-                <w:sz w:val="19"/>
-              </w:rPr>
-              <w:t>Contact Info</w:t>
-            </w:r>
-          </w:p>
-        </w:tc>
-      </w:tr>
-      <w:tr>
-        <w:tc>
-          <w:tcPr>
-            <w:tcW w:type="dxa" w:w="3408"/>
-          </w:tcPr>
-          <w:p>
-            <w:r>
-              <w:rPr>
-                <w:color w:val="334155"/>
-                <w:sz w:val="18"/>
-              </w:rPr>
-              <w:t>Professor Kofi Sarpong Adu-Manu</w:t>
-            </w:r>
-          </w:p>
-        </w:tc>
-        <w:tc>
-          <w:tcPr>
-            <w:tcW w:type="dxa" w:w="3408"/>
-          </w:tcPr>
-          <w:p>
-            <w:r>
-              <w:rPr>
-                <w:color w:val="334155"/>
-                <w:sz w:val="18"/>
-              </w:rPr>
-              <w:t>Dept. of Computer Science, University of Ghana</w:t>
-            </w:r>
-          </w:p>
-        </w:tc>
-        <w:tc>
-          <w:tcPr>
-            <w:tcW w:type="dxa" w:w="3408"/>
-          </w:tcPr>
-          <w:p>
-            <w:r>
-              <w:rPr>
-                <w:color w:val="334155"/>
-                <w:sz w:val="18"/>
-              </w:rPr>
-              <w:t>kaysarpsnr@gmail.com / 0244602374</w:t>
-            </w:r>
-          </w:p>
-        </w:tc>
-      </w:tr>
-      <w:tr>
-        <w:tc>
-          <w:tcPr>
-            <w:tcW w:type="dxa" w:w="3408"/>
-          </w:tcPr>
-          <w:p>
-            <w:r>
-              <w:rPr>
-                <w:color w:val="334155"/>
-                <w:sz w:val="18"/>
-              </w:rPr>
-              <w:t>Alex Quao, PhD</w:t>
-            </w:r>
-          </w:p>
-        </w:tc>
-        <w:tc>
-          <w:tcPr>
-            <w:tcW w:type="dxa" w:w="3408"/>
-          </w:tcPr>
-          <w:p>
-            <w:r>
-              <w:rPr>
-                <w:color w:val="334155"/>
-                <w:sz w:val="18"/>
-              </w:rPr>
-              <w:t>CEO, Aréte Forge</w:t>
-            </w:r>
-          </w:p>
-        </w:tc>
-        <w:tc>
-          <w:tcPr>
-            <w:tcW w:type="dxa" w:w="3408"/>
-          </w:tcPr>
-          <w:p>
-            <w:r>
-              <w:rPr>
-                <w:color w:val="334155"/>
-                <w:sz w:val="18"/>
-              </w:rPr>
-              <w:t>0592199757 / 0249221772</w:t>
-            </w:r>
-          </w:p>
-        </w:tc>
-      </w:tr>
-      <w:tr>
-        <w:tc>
-          <w:tcPr>
-            <w:tcW w:type="dxa" w:w="3408"/>
-          </w:tcPr>
-          <w:p>
-            <w:r>
-              <w:rPr>
-                <w:color w:val="334155"/>
-                <w:sz w:val="18"/>
-              </w:rPr>
-              <w:t>Dr. Ebenezer Okronipa</w:t>
-            </w:r>
-          </w:p>
-        </w:tc>
-        <w:tc>
-          <w:tcPr>
-            <w:tcW w:type="dxa" w:w="3408"/>
-          </w:tcPr>
-          <w:p>
-            <w:r>
-              <w:rPr>
-                <w:color w:val="334155"/>
-                <w:sz w:val="18"/>
-              </w:rPr>
-              <w:t>Pharmacist</w:t>
-            </w:r>
-          </w:p>
-        </w:tc>
-        <w:tc>
-          <w:tcPr>
-            <w:tcW w:type="dxa" w:w="3408"/>
-          </w:tcPr>
-          <w:p>
-            <w:r>
-              <w:rPr>
-                <w:color w:val="334155"/>
-                <w:sz w:val="18"/>
-              </w:rPr>
-              <w:t>0200994446</w:t>
-            </w:r>
-          </w:p>
-        </w:tc>
-      </w:tr>
-    </w:tbl>
+    <w:p>
+      <w:pPr>
+        <w:keepNext/>
+        <w:spacing w:before="80" w:after="20"/>
+      </w:pPr>
+      <w:r>
+        <w:rPr>
+          <w:rFonts w:ascii="Calibri" w:hAnsi="Calibri"/>
+          <w:b/>
+          <w:color w:val="1F4E79"/>
+          <w:sz w:val="19"/>
+        </w:rPr>
+        <w:t>Professor Kofi Sarpong Adu-Manu</w:t>
+      </w:r>
+    </w:p>
+    <w:p>
+      <w:pPr>
+        <w:spacing w:before="0" w:after="80"/>
+      </w:pPr>
+      <w:r>
+        <w:rPr>
+          <w:rFonts w:ascii="Calibri" w:hAnsi="Calibri"/>
+          <w:color w:val="595959"/>
+          <w:sz w:val="18"/>
+        </w:rPr>
+        <w:t>Dept. of Computer Science, University of Ghana  |  kaysarpsnr@gmail.com / 0244602374</w:t>
+      </w:r>
+    </w:p>
+    <w:p>
+      <w:pPr>
+        <w:keepNext/>
+        <w:spacing w:before="80" w:after="20"/>
+      </w:pPr>
+      <w:r>
+        <w:rPr>
+          <w:rFonts w:ascii="Calibri" w:hAnsi="Calibri"/>
+          <w:b/>
+          <w:color w:val="1F4E79"/>
+          <w:sz w:val="19"/>
+        </w:rPr>
+        <w:t>Alex Quao, PhD</w:t>
+      </w:r>
+    </w:p>
+    <w:p>
+      <w:pPr>
+        <w:spacing w:before="0" w:after="80"/>
+      </w:pPr>
+      <w:r>
+        <w:rPr>
+          <w:rFonts w:ascii="Calibri" w:hAnsi="Calibri"/>
+          <w:color w:val="595959"/>
+          <w:sz w:val="18"/>
+        </w:rPr>
+        <w:t>CEO, Aréte Forge  |  0592199757 / 0249221772</w:t>
+      </w:r>
+    </w:p>
+    <w:p>
+      <w:pPr>
+        <w:keepNext/>
+        <w:spacing w:before="80" w:after="20"/>
+      </w:pPr>
+      <w:r>
+        <w:rPr>
+          <w:rFonts w:ascii="Calibri" w:hAnsi="Calibri"/>
+          <w:b/>
+          <w:color w:val="1F4E79"/>
+          <w:sz w:val="19"/>
+        </w:rPr>
+        <w:t>Dr. Ebenezer Okronipa</w:t>
+      </w:r>
+    </w:p>
+    <w:p>
+      <w:pPr>
+        <w:spacing w:before="0" w:after="80"/>
+      </w:pPr>
+      <w:r>
+        <w:rPr>
+          <w:rFonts w:ascii="Calibri" w:hAnsi="Calibri"/>
+          <w:color w:val="595959"/>
+          <w:sz w:val="18"/>
+        </w:rPr>
+        <w:t>Pharmacist  |  0200994446</w:t>
+      </w:r>
+    </w:p>
     <w:sectPr>
       <w:pgSz w:w="12240" w:h="15840"/>
-      <w:pgMar w:top="1008" w:right="1008" w:bottom="1008" w:left="1008" w:header="720" w:footer="720" w:gutter="0"/>
+      <w:pgMar w:top="1080" w:right="1080" w:bottom="1080" w:left="1080" w:header="720" w:footer="720" w:gutter="0"/>
       <w:cols w:space="720"/>
       <w:docGrid w:linePitch="360"/>
     </w:sectPr>

</xml_diff>

<commit_message>
Update downloadable Word CV with original Calibri font hierarchy, clean project showcase, and clickable OpenXML links
</commit_message>
<xml_diff>
--- a/Alex_Teye_Ametepey_CV.docx
+++ b/Alex_Teye_Ametepey_CV.docx
@@ -410,7 +410,7 @@
           <w:color w:val="1F4E79"/>
           <w:sz w:val="19"/>
         </w:rPr>
-        <w:t xml:space="preserve">Enterprise ERP &amp; Custom CMS Solutions: </w:t>
+        <w:t xml:space="preserve">UGDS Customer Care System: </w:t>
       </w:r>
       <w:r>
         <w:rPr>
@@ -418,7 +418,7 @@
           <w:color w:val="595959"/>
           <w:sz w:val="19"/>
         </w:rPr>
-        <w:t>Architected multi-tenant database schemas, automated operational workflows, and role-based access control (RBAC) systems across diverse client requirements.</w:t>
+        <w:t>Led the full-stack architecture, API endpoint specifications, and database performance optimization for real-time customer care and ticket escalation.</w:t>
       </w:r>
     </w:p>
     <w:p>
@@ -474,7 +474,7 @@
           <w:color w:val="1F4E79"/>
           <w:sz w:val="19"/>
         </w:rPr>
-        <w:t xml:space="preserve">Church Management &amp; Operations System (SPS): </w:t>
+        <w:t xml:space="preserve">EcoPulse Web Platform: </w:t>
       </w:r>
       <w:r>
         <w:rPr>
@@ -482,7 +482,7 @@
           <w:color w:val="595959"/>
           <w:sz w:val="19"/>
         </w:rPr>
-        <w:t>Engineered an integrated platform for database administration, member tracking, and automated service coordination.</w:t>
+        <w:t>Developed an ecological analytics and sustainability tracking platform displaying real-time environmental metrics and data visualizations.</w:t>
       </w:r>
     </w:p>
     <w:p>
@@ -506,7 +506,7 @@
           <w:color w:val="1F4E79"/>
           <w:sz w:val="19"/>
         </w:rPr>
-        <w:t xml:space="preserve">UGDS System: </w:t>
+        <w:t xml:space="preserve">Queen Tracker System: </w:t>
       </w:r>
       <w:r>
         <w:rPr>
@@ -514,7 +514,71 @@
           <w:color w:val="595959"/>
           <w:sz w:val="19"/>
         </w:rPr>
-        <w:t>Led the complete full-stack architecture, API endpoint specifications, and database performance optimization as Lead Engineer and Full-Stack Developer.</w:t>
+        <w:t>Engineered a resource and logistics tracking platform using serverless PostgreSQL for real-time state management and asset reporting.</w:t>
+      </w:r>
+    </w:p>
+    <w:p>
+      <w:pPr>
+        <w:pStyle w:val="ListParagraph"/>
+        <w:spacing w:before="0" w:after="60" w:line="276" w:lineRule="auto"/>
+        <w:ind w:left="360"/>
+      </w:pPr>
+      <w:r>
+        <w:rPr>
+          <w:rFonts w:ascii="Calibri" w:hAnsi="Calibri"/>
+          <w:color w:val="1F4E79"/>
+          <w:sz w:val="19"/>
+        </w:rPr>
+        <w:t xml:space="preserve">• </w:t>
+      </w:r>
+      <w:r>
+        <w:rPr>
+          <w:rFonts w:ascii="Calibri" w:hAnsi="Calibri"/>
+          <w:b/>
+          <w:color w:val="1F4E79"/>
+          <w:sz w:val="19"/>
+        </w:rPr>
+        <w:t xml:space="preserve">Enterprise ERP &amp; Custom CMS Solutions: </w:t>
+      </w:r>
+      <w:r>
+        <w:rPr>
+          <w:rFonts w:ascii="Calibri" w:hAnsi="Calibri"/>
+          <w:color w:val="595959"/>
+          <w:sz w:val="19"/>
+        </w:rPr>
+        <w:t>Architected multi-tenant database schemas, automated operational workflows, and role-based access control (RBAC) systems across diverse client requirements.</w:t>
+      </w:r>
+    </w:p>
+    <w:p>
+      <w:pPr>
+        <w:pStyle w:val="ListParagraph"/>
+        <w:spacing w:before="0" w:after="60" w:line="276" w:lineRule="auto"/>
+        <w:ind w:left="360"/>
+      </w:pPr>
+      <w:r>
+        <w:rPr>
+          <w:rFonts w:ascii="Calibri" w:hAnsi="Calibri"/>
+          <w:color w:val="1F4E79"/>
+          <w:sz w:val="19"/>
+        </w:rPr>
+        <w:t xml:space="preserve">• </w:t>
+      </w:r>
+      <w:r>
+        <w:rPr>
+          <w:rFonts w:ascii="Calibri" w:hAnsi="Calibri"/>
+          <w:b/>
+          <w:color w:val="1F4E79"/>
+          <w:sz w:val="19"/>
+        </w:rPr>
+        <w:t xml:space="preserve">Church Management &amp; Operations System (SPS): </w:t>
+      </w:r>
+      <w:r>
+        <w:rPr>
+          <w:rFonts w:ascii="Calibri" w:hAnsi="Calibri"/>
+          <w:color w:val="595959"/>
+          <w:sz w:val="19"/>
+        </w:rPr>
+        <w:t>Engineered an integrated platform for database administration, member tracking, and automated service coordination.</w:t>
       </w:r>
     </w:p>
     <w:p>
@@ -831,7 +895,7 @@
           <w:sz w:val="18"/>
         </w:rPr>
         <w:tab/>
-        <w:t>2023 – Present</w:t>
+        <w:t>2023 - Present</w:t>
       </w:r>
     </w:p>
     <w:p>
@@ -918,7 +982,7 @@
           <w:sz w:val="18"/>
         </w:rPr>
         <w:tab/>
-        <w:t>2023 – Present</w:t>
+        <w:t>2023 - Present</w:t>
       </w:r>
     </w:p>
     <w:p>

</xml_diff>

<commit_message>
Remove Queen Tracker System from portfolio projects and downloadable Word CV
</commit_message>
<xml_diff>
--- a/Alex_Teye_Ametepey_CV.docx
+++ b/Alex_Teye_Ametepey_CV.docx
@@ -483,38 +483,6 @@
           <w:sz w:val="19"/>
         </w:rPr>
         <w:t>Developed an ecological analytics and sustainability tracking platform displaying real-time environmental metrics and data visualizations.</w:t>
-      </w:r>
-    </w:p>
-    <w:p>
-      <w:pPr>
-        <w:pStyle w:val="ListParagraph"/>
-        <w:spacing w:before="0" w:after="60" w:line="276" w:lineRule="auto"/>
-        <w:ind w:left="360"/>
-      </w:pPr>
-      <w:r>
-        <w:rPr>
-          <w:rFonts w:ascii="Calibri" w:hAnsi="Calibri"/>
-          <w:color w:val="1F4E79"/>
-          <w:sz w:val="19"/>
-        </w:rPr>
-        <w:t xml:space="preserve">• </w:t>
-      </w:r>
-      <w:r>
-        <w:rPr>
-          <w:rFonts w:ascii="Calibri" w:hAnsi="Calibri"/>
-          <w:b/>
-          <w:color w:val="1F4E79"/>
-          <w:sz w:val="19"/>
-        </w:rPr>
-        <w:t xml:space="preserve">Queen Tracker System: </w:t>
-      </w:r>
-      <w:r>
-        <w:rPr>
-          <w:rFonts w:ascii="Calibri" w:hAnsi="Calibri"/>
-          <w:color w:val="595959"/>
-          <w:sz w:val="19"/>
-        </w:rPr>
-        <w:t>Engineered a resource and logistics tracking platform using serverless PostgreSQL for real-time state management and asset reporting.</w:t>
       </w:r>
     </w:p>
     <w:p>

</xml_diff>

<commit_message>
Enhance Word CV layout with executive section divider lines under all section headers
</commit_message>
<xml_diff>
--- a/Alex_Teye_Ametepey_CV.docx
+++ b/Alex_Teye_Ametepey_CV.docx
@@ -33,6 +33,9 @@
     <w:p>
       <w:pPr>
         <w:spacing w:after="280"/>
+        <w:pBdr>
+          <w:bottom w:val="single" w:sz="8" w:space="5" w:color="1F4E79"/>
+        </w:pBdr>
       </w:pPr>
       <w:r>
         <w:rPr>
@@ -111,6 +114,9 @@
       <w:pPr>
         <w:keepNext/>
         <w:spacing w:before="280" w:after="80"/>
+        <w:pBdr>
+          <w:bottom w:val="single" w:sz="6" w:space="3" w:color="2E75B6"/>
+        </w:pBdr>
       </w:pPr>
       <w:r>
         <w:rPr>
@@ -139,6 +145,9 @@
       <w:pPr>
         <w:keepNext/>
         <w:spacing w:before="280" w:after="80"/>
+        <w:pBdr>
+          <w:bottom w:val="single" w:sz="6" w:space="3" w:color="2E75B6"/>
+        </w:pBdr>
       </w:pPr>
       <w:r>
         <w:rPr>
@@ -346,6 +355,9 @@
       <w:pPr>
         <w:keepNext/>
         <w:spacing w:before="280" w:after="80"/>
+        <w:pBdr>
+          <w:bottom w:val="single" w:sz="6" w:space="3" w:color="2E75B6"/>
+        </w:pBdr>
       </w:pPr>
       <w:r>
         <w:rPr>
@@ -553,6 +565,9 @@
       <w:pPr>
         <w:keepNext/>
         <w:spacing w:before="280" w:after="80"/>
+        <w:pBdr>
+          <w:bottom w:val="single" w:sz="6" w:space="3" w:color="2E75B6"/>
+        </w:pBdr>
       </w:pPr>
       <w:r>
         <w:rPr>
@@ -1003,6 +1018,9 @@
       <w:pPr>
         <w:keepNext/>
         <w:spacing w:before="280" w:after="80"/>
+        <w:pBdr>
+          <w:bottom w:val="single" w:sz="6" w:space="3" w:color="2E75B6"/>
+        </w:pBdr>
       </w:pPr>
       <w:r>
         <w:rPr>
@@ -1094,6 +1112,9 @@
       <w:pPr>
         <w:keepNext/>
         <w:spacing w:before="280" w:after="80"/>
+        <w:pBdr>
+          <w:bottom w:val="single" w:sz="6" w:space="3" w:color="2E75B6"/>
+        </w:pBdr>
       </w:pPr>
       <w:r>
         <w:rPr>

</xml_diff>

<commit_message>
Align Word CV layout with exact right-aligned tab stops for dates, executive color hierarchy, and section border lines matching original resume
</commit_message>
<xml_diff>
--- a/Alex_Teye_Ametepey_CV.docx
+++ b/Alex_Teye_Ametepey_CV.docx
@@ -4,7 +4,7 @@
   <w:body>
     <w:p>
       <w:pPr>
-        <w:spacing w:after="40"/>
+        <w:spacing w:before="0" w:after="40"/>
       </w:pPr>
       <w:r>
         <w:rPr>
@@ -18,7 +18,7 @@
     </w:p>
     <w:p>
       <w:pPr>
-        <w:spacing w:after="120"/>
+        <w:spacing w:before="0" w:after="120"/>
       </w:pPr>
       <w:r>
         <w:rPr>
@@ -32,7 +32,7 @@
     </w:p>
     <w:p>
       <w:pPr>
-        <w:spacing w:after="280"/>
+        <w:spacing w:before="0" w:after="280"/>
         <w:pBdr>
           <w:bottom w:val="single" w:sz="8" w:space="5" w:color="1F4E79"/>
         </w:pBdr>
@@ -43,7 +43,31 @@
           <w:color w:val="595959"/>
           <w:sz w:val="19"/>
         </w:rPr>
-        <w:t xml:space="preserve">Accra, Ghana  |  0549044977  |  </w:t>
+        <w:t>Accra, Ghana</w:t>
+      </w:r>
+      <w:r>
+        <w:rPr>
+          <w:rFonts w:ascii="Calibri" w:hAnsi="Calibri"/>
+          <w:color w:val="AAAAAA"/>
+          <w:sz w:val="19"/>
+        </w:rPr>
+        <w:t xml:space="preserve">  |  </w:t>
+      </w:r>
+      <w:r>
+        <w:rPr>
+          <w:rFonts w:ascii="Calibri" w:hAnsi="Calibri"/>
+          <w:color w:val="595959"/>
+          <w:sz w:val="19"/>
+        </w:rPr>
+        <w:t>0549044977</w:t>
+      </w:r>
+      <w:r>
+        <w:rPr>
+          <w:rFonts w:ascii="Calibri" w:hAnsi="Calibri"/>
+          <w:color w:val="AAAAAA"/>
+          <w:sz w:val="19"/>
+        </w:rPr>
+        <w:t xml:space="preserve">  |  </w:t>
       </w:r>
       <w:hyperlink r:id="rId9">
         <w:r>
@@ -58,7 +82,7 @@
       <w:r>
         <w:rPr>
           <w:rFonts w:ascii="Calibri" w:hAnsi="Calibri"/>
-          <w:color w:val="595959"/>
+          <w:color w:val="AAAAAA"/>
           <w:sz w:val="19"/>
         </w:rPr>
         <w:t xml:space="preserve">  |  </w:t>
@@ -76,7 +100,7 @@
       <w:r>
         <w:rPr>
           <w:rFonts w:ascii="Calibri" w:hAnsi="Calibri"/>
-          <w:color w:val="595959"/>
+          <w:color w:val="AAAAAA"/>
           <w:sz w:val="19"/>
         </w:rPr>
         <w:t xml:space="preserve">  |  </w:t>
@@ -94,7 +118,7 @@
       <w:r>
         <w:rPr>
           <w:rFonts w:ascii="Calibri" w:hAnsi="Calibri"/>
-          <w:color w:val="595959"/>
+          <w:color w:val="AAAAAA"/>
           <w:sz w:val="19"/>
         </w:rPr>
         <w:t xml:space="preserve">  |  </w:t>
@@ -130,7 +154,7 @@
     </w:p>
     <w:p>
       <w:pPr>
-        <w:spacing w:after="200" w:line="276" w:lineRule="auto"/>
+        <w:spacing w:before="60" w:after="160" w:line="276" w:lineRule="auto"/>
       </w:pPr>
       <w:r>
         <w:rPr>
@@ -162,7 +186,7 @@
     <w:p>
       <w:pPr>
         <w:pStyle w:val="ListParagraph"/>
-        <w:spacing w:before="0" w:after="60" w:line="276" w:lineRule="auto"/>
+        <w:spacing w:before="40" w:after="40" w:line="276" w:lineRule="auto"/>
         <w:ind w:left="360"/>
       </w:pPr>
       <w:r>
@@ -194,7 +218,7 @@
     <w:p>
       <w:pPr>
         <w:pStyle w:val="ListParagraph"/>
-        <w:spacing w:before="0" w:after="60" w:line="276" w:lineRule="auto"/>
+        <w:spacing w:before="40" w:after="40" w:line="276" w:lineRule="auto"/>
         <w:ind w:left="360"/>
       </w:pPr>
       <w:r>
@@ -226,7 +250,7 @@
     <w:p>
       <w:pPr>
         <w:pStyle w:val="ListParagraph"/>
-        <w:spacing w:before="0" w:after="60" w:line="276" w:lineRule="auto"/>
+        <w:spacing w:before="40" w:after="40" w:line="276" w:lineRule="auto"/>
         <w:ind w:left="360"/>
       </w:pPr>
       <w:r>
@@ -258,7 +282,7 @@
     <w:p>
       <w:pPr>
         <w:pStyle w:val="ListParagraph"/>
-        <w:spacing w:before="0" w:after="60" w:line="276" w:lineRule="auto"/>
+        <w:spacing w:before="40" w:after="40" w:line="276" w:lineRule="auto"/>
         <w:ind w:left="360"/>
       </w:pPr>
       <w:r>
@@ -290,7 +314,7 @@
     <w:p>
       <w:pPr>
         <w:pStyle w:val="ListParagraph"/>
-        <w:spacing w:before="0" w:after="60" w:line="276" w:lineRule="auto"/>
+        <w:spacing w:before="40" w:after="40" w:line="276" w:lineRule="auto"/>
         <w:ind w:left="360"/>
       </w:pPr>
       <w:r>
@@ -322,7 +346,7 @@
     <w:p>
       <w:pPr>
         <w:pStyle w:val="ListParagraph"/>
-        <w:spacing w:before="0" w:after="60" w:line="276" w:lineRule="auto"/>
+        <w:spacing w:before="40" w:after="40" w:line="276" w:lineRule="auto"/>
         <w:ind w:left="360"/>
       </w:pPr>
       <w:r>
@@ -372,7 +396,7 @@
     <w:p>
       <w:pPr>
         <w:pStyle w:val="ListParagraph"/>
-        <w:spacing w:before="0" w:after="60" w:line="276" w:lineRule="auto"/>
+        <w:spacing w:before="40" w:after="40" w:line="276" w:lineRule="auto"/>
         <w:ind w:left="360"/>
       </w:pPr>
       <w:r>
@@ -404,7 +428,7 @@
     <w:p>
       <w:pPr>
         <w:pStyle w:val="ListParagraph"/>
-        <w:spacing w:before="0" w:after="60" w:line="276" w:lineRule="auto"/>
+        <w:spacing w:before="40" w:after="40" w:line="276" w:lineRule="auto"/>
         <w:ind w:left="360"/>
       </w:pPr>
       <w:r>
@@ -436,7 +460,7 @@
     <w:p>
       <w:pPr>
         <w:pStyle w:val="ListParagraph"/>
-        <w:spacing w:before="0" w:after="60" w:line="276" w:lineRule="auto"/>
+        <w:spacing w:before="40" w:after="40" w:line="276" w:lineRule="auto"/>
         <w:ind w:left="360"/>
       </w:pPr>
       <w:r>
@@ -468,7 +492,7 @@
     <w:p>
       <w:pPr>
         <w:pStyle w:val="ListParagraph"/>
-        <w:spacing w:before="0" w:after="60" w:line="276" w:lineRule="auto"/>
+        <w:spacing w:before="40" w:after="40" w:line="276" w:lineRule="auto"/>
         <w:ind w:left="360"/>
       </w:pPr>
       <w:r>
@@ -500,7 +524,7 @@
     <w:p>
       <w:pPr>
         <w:pStyle w:val="ListParagraph"/>
-        <w:spacing w:before="0" w:after="60" w:line="276" w:lineRule="auto"/>
+        <w:spacing w:before="40" w:after="40" w:line="276" w:lineRule="auto"/>
         <w:ind w:left="360"/>
       </w:pPr>
       <w:r>
@@ -532,7 +556,7 @@
     <w:p>
       <w:pPr>
         <w:pStyle w:val="ListParagraph"/>
-        <w:spacing w:before="0" w:after="60" w:line="276" w:lineRule="auto"/>
+        <w:spacing w:before="40" w:after="40" w:line="276" w:lineRule="auto"/>
         <w:ind w:left="360"/>
       </w:pPr>
       <w:r>
@@ -582,14 +606,17 @@
     <w:p>
       <w:pPr>
         <w:keepNext/>
-        <w:spacing w:before="120" w:after="40"/>
+        <w:tabs>
+          <w:tab w:pos="10080" w:val="right"/>
+        </w:tabs>
+        <w:spacing w:before="160" w:after="40"/>
       </w:pPr>
       <w:r>
         <w:rPr>
           <w:rFonts w:ascii="Calibri" w:hAnsi="Calibri"/>
           <w:b/>
           <w:color w:val="1F4E79"/>
-          <w:sz w:val="20"/>
+          <w:sz w:val="21"/>
         </w:rPr>
         <w:t>Software Developer (Contract)</w:t>
       </w:r>
@@ -614,7 +641,7 @@
         <w:rPr>
           <w:rFonts w:ascii="Calibri" w:hAnsi="Calibri"/>
           <w:color w:val="595959"/>
-          <w:sz w:val="18"/>
+          <w:sz w:val="19"/>
         </w:rPr>
         <w:tab/>
         <w:t>Ongoing</w:t>
@@ -623,7 +650,7 @@
     <w:p>
       <w:pPr>
         <w:pStyle w:val="ListParagraph"/>
-        <w:spacing w:before="0" w:after="60" w:line="276" w:lineRule="auto"/>
+        <w:spacing w:before="40" w:after="40" w:line="276" w:lineRule="auto"/>
         <w:ind w:left="360"/>
       </w:pPr>
       <w:r>
@@ -646,7 +673,7 @@
     <w:p>
       <w:pPr>
         <w:pStyle w:val="ListParagraph"/>
-        <w:spacing w:before="0" w:after="60" w:line="276" w:lineRule="auto"/>
+        <w:spacing w:before="40" w:after="40" w:line="276" w:lineRule="auto"/>
         <w:ind w:left="360"/>
       </w:pPr>
       <w:r>
@@ -669,14 +696,17 @@
     <w:p>
       <w:pPr>
         <w:keepNext/>
-        <w:spacing w:before="120" w:after="40"/>
+        <w:tabs>
+          <w:tab w:pos="10080" w:val="right"/>
+        </w:tabs>
+        <w:spacing w:before="160" w:after="40"/>
       </w:pPr>
       <w:r>
         <w:rPr>
           <w:rFonts w:ascii="Calibri" w:hAnsi="Calibri"/>
           <w:b/>
           <w:color w:val="1F4E79"/>
-          <w:sz w:val="20"/>
+          <w:sz w:val="21"/>
         </w:rPr>
         <w:t>Backend Developer (Contract)</w:t>
       </w:r>
@@ -701,7 +731,7 @@
         <w:rPr>
           <w:rFonts w:ascii="Calibri" w:hAnsi="Calibri"/>
           <w:color w:val="595959"/>
-          <w:sz w:val="18"/>
+          <w:sz w:val="19"/>
         </w:rPr>
         <w:tab/>
         <w:t>Ongoing</w:t>
@@ -710,7 +740,7 @@
     <w:p>
       <w:pPr>
         <w:pStyle w:val="ListParagraph"/>
-        <w:spacing w:before="0" w:after="60" w:line="276" w:lineRule="auto"/>
+        <w:spacing w:before="40" w:after="40" w:line="276" w:lineRule="auto"/>
         <w:ind w:left="360"/>
       </w:pPr>
       <w:r>
@@ -733,7 +763,7 @@
     <w:p>
       <w:pPr>
         <w:pStyle w:val="ListParagraph"/>
-        <w:spacing w:before="0" w:after="60" w:line="276" w:lineRule="auto"/>
+        <w:spacing w:before="40" w:after="40" w:line="276" w:lineRule="auto"/>
         <w:ind w:left="360"/>
       </w:pPr>
       <w:r>
@@ -756,14 +786,17 @@
     <w:p>
       <w:pPr>
         <w:keepNext/>
-        <w:spacing w:before="120" w:after="40"/>
+        <w:tabs>
+          <w:tab w:pos="10080" w:val="right"/>
+        </w:tabs>
+        <w:spacing w:before="160" w:after="40"/>
       </w:pPr>
       <w:r>
         <w:rPr>
           <w:rFonts w:ascii="Calibri" w:hAnsi="Calibri"/>
           <w:b/>
           <w:color w:val="1F4E79"/>
-          <w:sz w:val="20"/>
+          <w:sz w:val="21"/>
         </w:rPr>
         <w:t>Growth Engineer (Contract)</w:t>
       </w:r>
@@ -788,7 +821,7 @@
         <w:rPr>
           <w:rFonts w:ascii="Calibri" w:hAnsi="Calibri"/>
           <w:color w:val="595959"/>
-          <w:sz w:val="18"/>
+          <w:sz w:val="19"/>
         </w:rPr>
         <w:tab/>
         <w:t>Ongoing</w:t>
@@ -797,7 +830,7 @@
     <w:p>
       <w:pPr>
         <w:pStyle w:val="ListParagraph"/>
-        <w:spacing w:before="0" w:after="60" w:line="276" w:lineRule="auto"/>
+        <w:spacing w:before="40" w:after="40" w:line="276" w:lineRule="auto"/>
         <w:ind w:left="360"/>
       </w:pPr>
       <w:r>
@@ -820,7 +853,7 @@
     <w:p>
       <w:pPr>
         <w:pStyle w:val="ListParagraph"/>
-        <w:spacing w:before="0" w:after="60" w:line="276" w:lineRule="auto"/>
+        <w:spacing w:before="40" w:after="40" w:line="276" w:lineRule="auto"/>
         <w:ind w:left="360"/>
       </w:pPr>
       <w:r>
@@ -843,14 +876,17 @@
     <w:p>
       <w:pPr>
         <w:keepNext/>
-        <w:spacing w:before="120" w:after="40"/>
+        <w:tabs>
+          <w:tab w:pos="10080" w:val="right"/>
+        </w:tabs>
+        <w:spacing w:before="160" w:after="40"/>
       </w:pPr>
       <w:r>
         <w:rPr>
           <w:rFonts w:ascii="Calibri" w:hAnsi="Calibri"/>
           <w:b/>
           <w:color w:val="1F4E79"/>
-          <w:sz w:val="20"/>
+          <w:sz w:val="21"/>
         </w:rPr>
         <w:t>Head of IT &amp; Media Systems</w:t>
       </w:r>
@@ -875,7 +911,7 @@
         <w:rPr>
           <w:rFonts w:ascii="Calibri" w:hAnsi="Calibri"/>
           <w:color w:val="595959"/>
-          <w:sz w:val="18"/>
+          <w:sz w:val="19"/>
         </w:rPr>
         <w:tab/>
         <w:t>2023 - Present</w:t>
@@ -884,7 +920,7 @@
     <w:p>
       <w:pPr>
         <w:pStyle w:val="ListParagraph"/>
-        <w:spacing w:before="0" w:after="60" w:line="276" w:lineRule="auto"/>
+        <w:spacing w:before="40" w:after="40" w:line="276" w:lineRule="auto"/>
         <w:ind w:left="360"/>
       </w:pPr>
       <w:r>
@@ -907,7 +943,7 @@
     <w:p>
       <w:pPr>
         <w:pStyle w:val="ListParagraph"/>
-        <w:spacing w:before="0" w:after="60" w:line="276" w:lineRule="auto"/>
+        <w:spacing w:before="40" w:after="40" w:line="276" w:lineRule="auto"/>
         <w:ind w:left="360"/>
       </w:pPr>
       <w:r>
@@ -930,14 +966,17 @@
     <w:p>
       <w:pPr>
         <w:keepNext/>
-        <w:spacing w:before="120" w:after="40"/>
+        <w:tabs>
+          <w:tab w:pos="10080" w:val="right"/>
+        </w:tabs>
+        <w:spacing w:before="160" w:after="40"/>
       </w:pPr>
       <w:r>
         <w:rPr>
           <w:rFonts w:ascii="Calibri" w:hAnsi="Calibri"/>
           <w:b/>
           <w:color w:val="1F4E79"/>
-          <w:sz w:val="20"/>
+          <w:sz w:val="21"/>
         </w:rPr>
         <w:t>Research Assistant</w:t>
       </w:r>
@@ -962,7 +1001,7 @@
         <w:rPr>
           <w:rFonts w:ascii="Calibri" w:hAnsi="Calibri"/>
           <w:color w:val="595959"/>
-          <w:sz w:val="18"/>
+          <w:sz w:val="19"/>
         </w:rPr>
         <w:tab/>
         <w:t>2023 - Present</w:t>
@@ -971,7 +1010,7 @@
     <w:p>
       <w:pPr>
         <w:pStyle w:val="ListParagraph"/>
-        <w:spacing w:before="0" w:after="60" w:line="276" w:lineRule="auto"/>
+        <w:spacing w:before="40" w:after="40" w:line="276" w:lineRule="auto"/>
         <w:ind w:left="360"/>
       </w:pPr>
       <w:r>
@@ -994,7 +1033,7 @@
     <w:p>
       <w:pPr>
         <w:pStyle w:val="ListParagraph"/>
-        <w:spacing w:before="0" w:after="60" w:line="276" w:lineRule="auto"/>
+        <w:spacing w:before="40" w:after="40" w:line="276" w:lineRule="auto"/>
         <w:ind w:left="360"/>
       </w:pPr>
       <w:r>
@@ -1034,14 +1073,17 @@
     </w:p>
     <w:p>
       <w:pPr>
-        <w:spacing w:before="80" w:after="40"/>
+        <w:tabs>
+          <w:tab w:pos="10080" w:val="right"/>
+        </w:tabs>
+        <w:spacing w:before="120" w:after="40"/>
       </w:pPr>
       <w:r>
         <w:rPr>
           <w:rFonts w:ascii="Calibri" w:hAnsi="Calibri"/>
           <w:b/>
           <w:color w:val="1F4E79"/>
-          <w:sz w:val="20"/>
+          <w:sz w:val="21"/>
         </w:rPr>
         <w:t>MSc in Financial Engineering</w:t>
       </w:r>
@@ -1064,7 +1106,7 @@
         <w:rPr>
           <w:rFonts w:ascii="Calibri" w:hAnsi="Calibri"/>
           <w:color w:val="595959"/>
-          <w:sz w:val="18"/>
+          <w:sz w:val="19"/>
         </w:rPr>
         <w:tab/>
         <w:t>Ongoing</w:t>
@@ -1072,14 +1114,17 @@
     </w:p>
     <w:p>
       <w:pPr>
-        <w:spacing w:before="80" w:after="40"/>
+        <w:tabs>
+          <w:tab w:pos="10080" w:val="right"/>
+        </w:tabs>
+        <w:spacing w:before="120" w:after="40"/>
       </w:pPr>
       <w:r>
         <w:rPr>
           <w:rFonts w:ascii="Calibri" w:hAnsi="Calibri"/>
           <w:b/>
           <w:color w:val="1F4E79"/>
-          <w:sz w:val="20"/>
+          <w:sz w:val="21"/>
         </w:rPr>
         <w:t>BSc in Information Technology</w:t>
       </w:r>
@@ -1102,7 +1147,7 @@
         <w:rPr>
           <w:rFonts w:ascii="Calibri" w:hAnsi="Calibri"/>
           <w:color w:val="595959"/>
-          <w:sz w:val="18"/>
+          <w:sz w:val="19"/>
         </w:rPr>
         <w:tab/>
         <w:t>Graduated 2025</w:t>
@@ -1129,14 +1174,14 @@
     <w:p>
       <w:pPr>
         <w:keepNext/>
-        <w:spacing w:before="80" w:after="20"/>
+        <w:spacing w:before="120" w:after="20"/>
       </w:pPr>
       <w:r>
         <w:rPr>
           <w:rFonts w:ascii="Calibri" w:hAnsi="Calibri"/>
           <w:b/>
           <w:color w:val="1F4E79"/>
-          <w:sz w:val="19"/>
+          <w:sz w:val="20"/>
         </w:rPr>
         <w:t>Professor Kofi Sarpong Adu-Manu</w:t>
       </w:r>
@@ -1157,14 +1202,14 @@
     <w:p>
       <w:pPr>
         <w:keepNext/>
-        <w:spacing w:before="80" w:after="20"/>
+        <w:spacing w:before="120" w:after="20"/>
       </w:pPr>
       <w:r>
         <w:rPr>
           <w:rFonts w:ascii="Calibri" w:hAnsi="Calibri"/>
           <w:b/>
           <w:color w:val="1F4E79"/>
-          <w:sz w:val="19"/>
+          <w:sz w:val="20"/>
         </w:rPr>
         <w:t>Alex Quao, PhD</w:t>
       </w:r>
@@ -1185,14 +1230,14 @@
     <w:p>
       <w:pPr>
         <w:keepNext/>
-        <w:spacing w:before="80" w:after="20"/>
+        <w:spacing w:before="120" w:after="20"/>
       </w:pPr>
       <w:r>
         <w:rPr>
           <w:rFonts w:ascii="Calibri" w:hAnsi="Calibri"/>
           <w:b/>
           <w:color w:val="1F4E79"/>
-          <w:sz w:val="19"/>
+          <w:sz w:val="20"/>
         </w:rPr>
         <w:t>Dr. Ebenezer Okronipa</w:t>
       </w:r>

</xml_diff>

<commit_message>
Refine paragraph and item spacing within CV categories for consistent visual grouping and flow
</commit_message>
<xml_diff>
--- a/Alex_Teye_Ametepey_CV.docx
+++ b/Alex_Teye_Ametepey_CV.docx
@@ -186,7 +186,7 @@
     <w:p>
       <w:pPr>
         <w:pStyle w:val="ListParagraph"/>
-        <w:spacing w:before="40" w:after="40" w:line="276" w:lineRule="auto"/>
+        <w:spacing w:before="20" w:after="30" w:line="276" w:lineRule="auto"/>
         <w:ind w:left="360"/>
       </w:pPr>
       <w:r>
@@ -218,7 +218,7 @@
     <w:p>
       <w:pPr>
         <w:pStyle w:val="ListParagraph"/>
-        <w:spacing w:before="40" w:after="40" w:line="276" w:lineRule="auto"/>
+        <w:spacing w:before="20" w:after="30" w:line="276" w:lineRule="auto"/>
         <w:ind w:left="360"/>
       </w:pPr>
       <w:r>
@@ -250,7 +250,7 @@
     <w:p>
       <w:pPr>
         <w:pStyle w:val="ListParagraph"/>
-        <w:spacing w:before="40" w:after="40" w:line="276" w:lineRule="auto"/>
+        <w:spacing w:before="20" w:after="30" w:line="276" w:lineRule="auto"/>
         <w:ind w:left="360"/>
       </w:pPr>
       <w:r>
@@ -282,7 +282,7 @@
     <w:p>
       <w:pPr>
         <w:pStyle w:val="ListParagraph"/>
-        <w:spacing w:before="40" w:after="40" w:line="276" w:lineRule="auto"/>
+        <w:spacing w:before="20" w:after="30" w:line="276" w:lineRule="auto"/>
         <w:ind w:left="360"/>
       </w:pPr>
       <w:r>
@@ -314,7 +314,7 @@
     <w:p>
       <w:pPr>
         <w:pStyle w:val="ListParagraph"/>
-        <w:spacing w:before="40" w:after="40" w:line="276" w:lineRule="auto"/>
+        <w:spacing w:before="20" w:after="30" w:line="276" w:lineRule="auto"/>
         <w:ind w:left="360"/>
       </w:pPr>
       <w:r>
@@ -346,7 +346,7 @@
     <w:p>
       <w:pPr>
         <w:pStyle w:val="ListParagraph"/>
-        <w:spacing w:before="40" w:after="40" w:line="276" w:lineRule="auto"/>
+        <w:spacing w:before="20" w:after="30" w:line="276" w:lineRule="auto"/>
         <w:ind w:left="360"/>
       </w:pPr>
       <w:r>
@@ -396,7 +396,7 @@
     <w:p>
       <w:pPr>
         <w:pStyle w:val="ListParagraph"/>
-        <w:spacing w:before="40" w:after="40" w:line="276" w:lineRule="auto"/>
+        <w:spacing w:before="20" w:after="30" w:line="276" w:lineRule="auto"/>
         <w:ind w:left="360"/>
       </w:pPr>
       <w:r>
@@ -428,7 +428,7 @@
     <w:p>
       <w:pPr>
         <w:pStyle w:val="ListParagraph"/>
-        <w:spacing w:before="40" w:after="40" w:line="276" w:lineRule="auto"/>
+        <w:spacing w:before="20" w:after="30" w:line="276" w:lineRule="auto"/>
         <w:ind w:left="360"/>
       </w:pPr>
       <w:r>
@@ -460,7 +460,7 @@
     <w:p>
       <w:pPr>
         <w:pStyle w:val="ListParagraph"/>
-        <w:spacing w:before="40" w:after="40" w:line="276" w:lineRule="auto"/>
+        <w:spacing w:before="20" w:after="30" w:line="276" w:lineRule="auto"/>
         <w:ind w:left="360"/>
       </w:pPr>
       <w:r>
@@ -492,7 +492,7 @@
     <w:p>
       <w:pPr>
         <w:pStyle w:val="ListParagraph"/>
-        <w:spacing w:before="40" w:after="40" w:line="276" w:lineRule="auto"/>
+        <w:spacing w:before="20" w:after="30" w:line="276" w:lineRule="auto"/>
         <w:ind w:left="360"/>
       </w:pPr>
       <w:r>
@@ -524,7 +524,7 @@
     <w:p>
       <w:pPr>
         <w:pStyle w:val="ListParagraph"/>
-        <w:spacing w:before="40" w:after="40" w:line="276" w:lineRule="auto"/>
+        <w:spacing w:before="20" w:after="30" w:line="276" w:lineRule="auto"/>
         <w:ind w:left="360"/>
       </w:pPr>
       <w:r>
@@ -556,7 +556,7 @@
     <w:p>
       <w:pPr>
         <w:pStyle w:val="ListParagraph"/>
-        <w:spacing w:before="40" w:after="40" w:line="276" w:lineRule="auto"/>
+        <w:spacing w:before="20" w:after="30" w:line="276" w:lineRule="auto"/>
         <w:ind w:left="360"/>
       </w:pPr>
       <w:r>
@@ -650,7 +650,7 @@
     <w:p>
       <w:pPr>
         <w:pStyle w:val="ListParagraph"/>
-        <w:spacing w:before="40" w:after="40" w:line="276" w:lineRule="auto"/>
+        <w:spacing w:before="20" w:after="30" w:line="276" w:lineRule="auto"/>
         <w:ind w:left="360"/>
       </w:pPr>
       <w:r>
@@ -673,7 +673,7 @@
     <w:p>
       <w:pPr>
         <w:pStyle w:val="ListParagraph"/>
-        <w:spacing w:before="40" w:after="40" w:line="276" w:lineRule="auto"/>
+        <w:spacing w:before="20" w:after="30" w:line="276" w:lineRule="auto"/>
         <w:ind w:left="360"/>
       </w:pPr>
       <w:r>
@@ -740,7 +740,7 @@
     <w:p>
       <w:pPr>
         <w:pStyle w:val="ListParagraph"/>
-        <w:spacing w:before="40" w:after="40" w:line="276" w:lineRule="auto"/>
+        <w:spacing w:before="20" w:after="30" w:line="276" w:lineRule="auto"/>
         <w:ind w:left="360"/>
       </w:pPr>
       <w:r>
@@ -763,7 +763,7 @@
     <w:p>
       <w:pPr>
         <w:pStyle w:val="ListParagraph"/>
-        <w:spacing w:before="40" w:after="40" w:line="276" w:lineRule="auto"/>
+        <w:spacing w:before="20" w:after="30" w:line="276" w:lineRule="auto"/>
         <w:ind w:left="360"/>
       </w:pPr>
       <w:r>
@@ -830,7 +830,7 @@
     <w:p>
       <w:pPr>
         <w:pStyle w:val="ListParagraph"/>
-        <w:spacing w:before="40" w:after="40" w:line="276" w:lineRule="auto"/>
+        <w:spacing w:before="20" w:after="30" w:line="276" w:lineRule="auto"/>
         <w:ind w:left="360"/>
       </w:pPr>
       <w:r>
@@ -853,7 +853,7 @@
     <w:p>
       <w:pPr>
         <w:pStyle w:val="ListParagraph"/>
-        <w:spacing w:before="40" w:after="40" w:line="276" w:lineRule="auto"/>
+        <w:spacing w:before="20" w:after="30" w:line="276" w:lineRule="auto"/>
         <w:ind w:left="360"/>
       </w:pPr>
       <w:r>
@@ -920,7 +920,7 @@
     <w:p>
       <w:pPr>
         <w:pStyle w:val="ListParagraph"/>
-        <w:spacing w:before="40" w:after="40" w:line="276" w:lineRule="auto"/>
+        <w:spacing w:before="20" w:after="30" w:line="276" w:lineRule="auto"/>
         <w:ind w:left="360"/>
       </w:pPr>
       <w:r>
@@ -943,7 +943,7 @@
     <w:p>
       <w:pPr>
         <w:pStyle w:val="ListParagraph"/>
-        <w:spacing w:before="40" w:after="40" w:line="276" w:lineRule="auto"/>
+        <w:spacing w:before="20" w:after="30" w:line="276" w:lineRule="auto"/>
         <w:ind w:left="360"/>
       </w:pPr>
       <w:r>
@@ -1010,7 +1010,7 @@
     <w:p>
       <w:pPr>
         <w:pStyle w:val="ListParagraph"/>
-        <w:spacing w:before="40" w:after="40" w:line="276" w:lineRule="auto"/>
+        <w:spacing w:before="20" w:after="30" w:line="276" w:lineRule="auto"/>
         <w:ind w:left="360"/>
       </w:pPr>
       <w:r>
@@ -1033,7 +1033,7 @@
     <w:p>
       <w:pPr>
         <w:pStyle w:val="ListParagraph"/>
-        <w:spacing w:before="40" w:after="40" w:line="276" w:lineRule="auto"/>
+        <w:spacing w:before="20" w:after="30" w:line="276" w:lineRule="auto"/>
         <w:ind w:left="360"/>
       </w:pPr>
       <w:r>

</xml_diff>

<commit_message>
Update downloadable Word CV and website data with latest content (OBS, Freeshow, Learning & Exam Management System, EcoPulse Win/Mobile/Web & God's Eye IoT, Dr. Ebenezer Okronipa title)
</commit_message>
<xml_diff>
--- a/Alex_Teye_Ametepey_CV.docx
+++ b/Alex_Teye_Ametepey_CV.docx
@@ -212,7 +212,7 @@
           <w:color w:val="595959"/>
           <w:sz w:val="19"/>
         </w:rPr>
-        <w:t>Python, JavaScript (ES6+), Java, SQL, HTML5, CSS3</w:t>
+        <w:t>Python, JavaScript (ES6+), Java, etc.</w:t>
       </w:r>
     </w:p>
     <w:p>
@@ -372,7 +372,7 @@
           <w:color w:val="595959"/>
           <w:sz w:val="19"/>
         </w:rPr>
-        <w:t>Live Broadcast Routing (vMix)</w:t>
+        <w:t>Live Broadcast Routing (vMix), OBS, Freeshow, etc.</w:t>
       </w:r>
     </w:p>
     <w:p>
@@ -478,7 +478,7 @@
           <w:color w:val="1F4E79"/>
           <w:sz w:val="19"/>
         </w:rPr>
-        <w:t xml:space="preserve">Automated Examination Management System: </w:t>
+        <w:t xml:space="preserve">Learning and Examination Management System: </w:t>
       </w:r>
       <w:r>
         <w:rPr>
@@ -510,7 +510,7 @@
           <w:color w:val="1F4E79"/>
           <w:sz w:val="19"/>
         </w:rPr>
-        <w:t xml:space="preserve">EcoPulse Web Platform: </w:t>
+        <w:t xml:space="preserve">EcoPulse Web Platform [Win, mobile and web app, and God's Eye IoT integration]: </w:t>
       </w:r>
       <w:r>
         <w:rPr>
@@ -1252,7 +1252,7 @@
           <w:color w:val="595959"/>
           <w:sz w:val="18"/>
         </w:rPr>
-        <w:t>Pharmacist  |  0200994446</w:t>
+        <w:t>Pharmacist, General Overseer of EOM  |  0200994446</w:t>
       </w:r>
     </w:p>
     <w:sectPr>

</xml_diff>